<commit_message>
Update HRMS features and workflows
</commit_message>
<xml_diff>
--- a/backend/templates/offer_letter_template.docx
+++ b/backend/templates/offer_letter_template.docx
@@ -1,6 +1,6 @@
 
 <file path=word/document.xml><?xml version="1.0" encoding="utf-8"?>
-<w:document xmlns:wpc="http://schemas.microsoft.com/office/word/2010/wordprocessingCanvas" xmlns:mc="http://schemas.openxmlformats.org/markup-compatibility/2006" xmlns:o="urn:schemas-microsoft-com:office:office" xmlns:r="http://schemas.openxmlformats.org/officeDocument/2006/relationships" xmlns:m="http://schemas.openxmlformats.org/officeDocument/2006/math" xmlns:v="urn:schemas-microsoft-com:vml" xmlns:wp14="http://schemas.microsoft.com/office/word/2010/wordprocessingDrawing" xmlns:wp="http://schemas.openxmlformats.org/drawingml/2006/wordprocessingDrawing" xmlns:w10="urn:schemas-microsoft-com:office:word" xmlns:w="http://schemas.openxmlformats.org/wordprocessingml/2006/main" xmlns:w14="http://schemas.microsoft.com/office/word/2010/wordml" xmlns:w15="http://schemas.microsoft.com/office/word/2012/wordml" xmlns:wpg="http://schemas.microsoft.com/office/word/2010/wordprocessingGroup" xmlns:wpi="http://schemas.microsoft.com/office/word/2010/wordprocessingInk" xmlns:wne="http://schemas.microsoft.com/office/word/2006/wordml" xmlns:wps="http://schemas.microsoft.com/office/word/2010/wordprocessingShape" xmlns:cx="http://schemas.microsoft.com/office/drawing/2014/chartex" xmlns:cx1="http://schemas.microsoft.com/office/drawing/2015/9/8/chartex" xmlns:cx2="http://schemas.microsoft.com/office/drawing/2015/10/21/chartex" xmlns:cx3="http://schemas.microsoft.com/office/drawing/2016/5/9/chartex" xmlns:cx4="http://schemas.microsoft.com/office/drawing/2016/5/10/chartex" xmlns:cx5="http://schemas.microsoft.com/office/drawing/2016/5/11/chartex" xmlns:cx6="http://schemas.microsoft.com/office/drawing/2016/5/12/chartex" xmlns:cx7="http://schemas.microsoft.com/office/drawing/2016/5/13/chartex" xmlns:cx8="http://schemas.microsoft.com/office/drawing/2016/5/14/chartex" xmlns:aink="http://schemas.microsoft.com/office/drawing/2016/ink" xmlns:am3d="http://schemas.microsoft.com/office/drawing/2017/model3d" xmlns:w16cex="http://schemas.microsoft.com/office/word/2018/wordml/cex" xmlns:w16cid="http://schemas.microsoft.com/office/word/2016/wordml/cid" xmlns:w16="http://schemas.microsoft.com/office/word/2018/wordml" xmlns:w16sdtdh="http://schemas.microsoft.com/office/word/2020/wordml/sdtdatahash" xmlns:w16se="http://schemas.microsoft.com/office/word/2015/wordml/symex" mc:Ignorable="w14 w15 wp14">
+<w:document xmlns:mc="http://schemas.openxmlformats.org/markup-compatibility/2006" xmlns:r="http://schemas.openxmlformats.org/officeDocument/2006/relationships" xmlns:w="http://schemas.openxmlformats.org/wordprocessingml/2006/main" mc:Ignorable="w14 w15 wp14">
   <w:body>
     <w:p>
       <w:pPr>
@@ -8,6 +8,7 @@
           <w:tab w:val="right" w:pos="9206"/>
         </w:tabs>
         <w:spacing w:after="80" w:before="0" w:line="276" w:lineRule="auto"/>
+        <w:jc w:val="both"/>
       </w:pPr>
       <w:r>
         <w:rPr>
@@ -15,16 +16,16 @@
           <w:b/>
           <w:bCs/>
           <w:color w:val="000000"/>
-          <w:sz w:val="22"/>
-          <w:szCs w:val="22"/>
+          <w:sz w:val="24"/>
+          <w:szCs w:val="24"/>
         </w:rPr>
         <w:t xml:space="preserve">{{OfferCode}}</w:t>
       </w:r>
       <w:r>
         <w:rPr>
           <w:rFonts w:ascii="Verdana" w:cs="Verdana" w:eastAsia="Verdana" w:hAnsi="Verdana"/>
-          <w:sz w:val="22"/>
-          <w:szCs w:val="22"/>
+          <w:sz w:val="24"/>
+          <w:szCs w:val="24"/>
         </w:rPr>
         <w:t xml:space="preserve">	</w:t>
       </w:r>
@@ -32,8 +33,8 @@
         <w:rPr>
           <w:rFonts w:ascii="Verdana" w:cs="Verdana" w:eastAsia="Verdana" w:hAnsi="Verdana"/>
           <w:color w:val="000000"/>
-          <w:sz w:val="22"/>
-          <w:szCs w:val="22"/>
+          <w:sz w:val="24"/>
+          <w:szCs w:val="24"/>
         </w:rPr>
         <w:t xml:space="preserve">&lt;Dt: {{OfferDate}}&gt;</w:t>
       </w:r>
@@ -41,11 +42,13 @@
     <w:p>
       <w:pPr>
         <w:spacing w:after="80" w:before="0" w:line="276" w:lineRule="auto"/>
-      </w:pPr>
-    </w:p>
-    <w:p>
-      <w:pPr>
-        <w:spacing w:after="80" w:before="0" w:line="276" w:lineRule="auto"/>
+        <w:jc w:val="both"/>
+      </w:pPr>
+    </w:p>
+    <w:p>
+      <w:pPr>
+        <w:spacing w:after="80" w:before="0" w:line="276" w:lineRule="auto"/>
+        <w:jc w:val="both"/>
       </w:pPr>
       <w:r>
         <w:rPr>
@@ -53,8 +56,8 @@
           <w:b/>
           <w:bCs/>
           <w:color w:val="000000"/>
-          <w:sz w:val="22"/>
-          <w:szCs w:val="22"/>
+          <w:sz w:val="24"/>
+          <w:szCs w:val="24"/>
         </w:rPr>
         <w:t xml:space="preserve">{{CandidateName}}</w:t>
       </w:r>
@@ -62,11 +65,13 @@
     <w:p>
       <w:pPr>
         <w:spacing w:after="80" w:before="0" w:line="276" w:lineRule="auto"/>
+        <w:jc w:val="both"/>
       </w:pPr>
     </w:p>
     <w:p>
       <w:pPr>
         <w:spacing w:after="120" w:before="0" w:line="276" w:lineRule="auto"/>
+        <w:jc w:val="both"/>
       </w:pPr>
       <w:r>
         <w:rPr>
@@ -89,8 +94,8 @@
         <w:rPr>
           <w:rFonts w:ascii="Verdana" w:cs="Verdana" w:eastAsia="Verdana" w:hAnsi="Verdana"/>
           <w:color w:val="000000"/>
-          <w:sz w:val="22"/>
-          <w:szCs w:val="22"/>
+          <w:sz w:val="24"/>
+          <w:szCs w:val="24"/>
         </w:rPr>
         <w:t xml:space="preserve">Dear {{CandidateName}},</w:t>
       </w:r>
@@ -104,8 +109,8 @@
         <w:rPr>
           <w:rFonts w:ascii="Verdana" w:cs="Verdana" w:eastAsia="Verdana" w:hAnsi="Verdana"/>
           <w:color w:val="000000"/>
-          <w:sz w:val="22"/>
-          <w:szCs w:val="22"/>
+          <w:sz w:val="24"/>
+          <w:szCs w:val="24"/>
         </w:rPr>
         <w:t xml:space="preserve">Thank you for your interest and time you have spent with us during the interview. Subsequent to the discussions you had with us, we are pleased to offer you the position "{{Designation}}" in our company with the following terms and conditions.</w:t>
       </w:r>
@@ -113,11 +118,13 @@
     <w:p>
       <w:pPr>
         <w:spacing w:after="80" w:before="0" w:line="276" w:lineRule="auto"/>
+        <w:jc w:val="both"/>
       </w:pPr>
     </w:p>
     <w:p>
       <w:pPr>
         <w:spacing w:after="40" w:before="120" w:line="276" w:lineRule="auto"/>
+        <w:jc w:val="both"/>
       </w:pPr>
       <w:r>
         <w:rPr>
@@ -125,8 +132,8 @@
           <w:b/>
           <w:bCs/>
           <w:color w:val="000000"/>
-          <w:sz w:val="22"/>
-          <w:szCs w:val="22"/>
+          <w:sz w:val="24"/>
+          <w:szCs w:val="24"/>
         </w:rPr>
         <w:t xml:space="preserve">01.  DATE OF JOINING:</w:t>
       </w:r>
@@ -140,8 +147,8 @@
         <w:rPr>
           <w:rFonts w:ascii="Verdana" w:cs="Verdana" w:eastAsia="Verdana" w:hAnsi="Verdana"/>
           <w:color w:val="000000"/>
-          <w:sz w:val="22"/>
-          <w:szCs w:val="22"/>
+          <w:sz w:val="24"/>
+          <w:szCs w:val="24"/>
         </w:rPr>
         <w:t xml:space="preserve">As agreed during the discussion, you are requested to join the services on or before {{DateOfJoining}}.</w:t>
       </w:r>
@@ -149,6 +156,7 @@
     <w:p>
       <w:pPr>
         <w:spacing w:after="40" w:before="120" w:line="276" w:lineRule="auto"/>
+        <w:jc w:val="both"/>
       </w:pPr>
       <w:r>
         <w:rPr>
@@ -156,8 +164,8 @@
           <w:b/>
           <w:bCs/>
           <w:color w:val="000000"/>
-          <w:sz w:val="22"/>
-          <w:szCs w:val="22"/>
+          <w:sz w:val="24"/>
+          <w:szCs w:val="24"/>
         </w:rPr>
         <w:t xml:space="preserve">02.  DESIGNATION:</w:t>
       </w:r>
@@ -171,8 +179,8 @@
         <w:rPr>
           <w:rFonts w:ascii="Verdana" w:cs="Verdana" w:eastAsia="Verdana" w:hAnsi="Verdana"/>
           <w:color w:val="000000"/>
-          <w:sz w:val="22"/>
-          <w:szCs w:val="22"/>
+          <w:sz w:val="24"/>
+          <w:szCs w:val="24"/>
         </w:rPr>
         <w:t xml:space="preserve">You will be designated as "{{Designation}}" and reporting's to the authority notified by the Management from time to time.</w:t>
       </w:r>
@@ -180,6 +188,7 @@
     <w:p>
       <w:pPr>
         <w:spacing w:after="40" w:before="120" w:line="276" w:lineRule="auto"/>
+        <w:jc w:val="both"/>
       </w:pPr>
       <w:r>
         <w:rPr>
@@ -187,8 +196,8 @@
           <w:b/>
           <w:bCs/>
           <w:color w:val="000000"/>
-          <w:sz w:val="22"/>
-          <w:szCs w:val="22"/>
+          <w:sz w:val="24"/>
+          <w:szCs w:val="24"/>
         </w:rPr>
         <w:t xml:space="preserve">03.  PLACE OF POSTING:</w:t>
       </w:r>
@@ -202,8 +211,8 @@
         <w:rPr>
           <w:rFonts w:ascii="Verdana" w:cs="Verdana" w:eastAsia="Verdana" w:hAnsi="Verdana"/>
           <w:color w:val="000000"/>
-          <w:sz w:val="22"/>
-          <w:szCs w:val="22"/>
+          <w:sz w:val="24"/>
+          <w:szCs w:val="24"/>
         </w:rPr>
         <w:t xml:space="preserve">Your place of posting is as discussed during the interview. However, the Management may place you on any assignment in any unit/department/ associate concern of the Company in or out of the said place, as it may be necessary, in its absolute discretion from time to time, subject to the provision that your remuneration and facilities are not adversely affected.</w:t>
       </w:r>
@@ -211,6 +220,7 @@
     <w:p>
       <w:pPr>
         <w:spacing w:after="40" w:before="120" w:line="276" w:lineRule="auto"/>
+        <w:jc w:val="both"/>
       </w:pPr>
       <w:r>
         <w:rPr>
@@ -218,8 +228,8 @@
           <w:b/>
           <w:bCs/>
           <w:color w:val="000000"/>
-          <w:sz w:val="22"/>
-          <w:szCs w:val="22"/>
+          <w:sz w:val="24"/>
+          <w:szCs w:val="24"/>
         </w:rPr>
         <w:t xml:space="preserve">04.  PROBATION:</w:t>
       </w:r>
@@ -233,8 +243,8 @@
         <w:rPr>
           <w:rFonts w:ascii="Verdana" w:cs="Verdana" w:eastAsia="Verdana" w:hAnsi="Verdana"/>
           <w:color w:val="000000"/>
-          <w:sz w:val="22"/>
-          <w:szCs w:val="22"/>
+          <w:sz w:val="24"/>
+          <w:szCs w:val="24"/>
         </w:rPr>
         <w:t xml:space="preserve">You will be on probation for three months from the date of joining.  Your probationary period will be assumed to have been extended until such time you are informed in writing.</w:t>
       </w:r>
@@ -242,6 +252,7 @@
     <w:p>
       <w:pPr>
         <w:spacing w:after="40" w:before="120" w:line="276" w:lineRule="auto"/>
+        <w:jc w:val="both"/>
       </w:pPr>
       <w:r>
         <w:rPr>
@@ -249,8 +260,8 @@
           <w:b/>
           <w:bCs/>
           <w:color w:val="000000"/>
-          <w:sz w:val="22"/>
-          <w:szCs w:val="22"/>
+          <w:sz w:val="24"/>
+          <w:szCs w:val="24"/>
         </w:rPr>
         <w:t xml:space="preserve">05.  COMPENSATION &amp; BENEFITS:</w:t>
       </w:r>
@@ -264,8 +275,8 @@
         <w:rPr>
           <w:rFonts w:ascii="Verdana" w:cs="Verdana" w:eastAsia="Verdana" w:hAnsi="Verdana"/>
           <w:color w:val="000000"/>
-          <w:sz w:val="22"/>
-          <w:szCs w:val="22"/>
+          <w:sz w:val="24"/>
+          <w:szCs w:val="24"/>
         </w:rPr>
         <w:t xml:space="preserve">Please refer to Annexure II for the details as applicable to you. Your job title and compensation have been discussed with you and we have mutually agreed upon the same.</w:t>
       </w:r>
@@ -273,6 +284,7 @@
     <w:p>
       <w:pPr>
         <w:spacing w:after="40" w:before="120" w:line="276" w:lineRule="auto"/>
+        <w:jc w:val="both"/>
       </w:pPr>
       <w:r>
         <w:rPr>
@@ -280,8 +292,8 @@
           <w:b/>
           <w:bCs/>
           <w:color w:val="000000"/>
-          <w:sz w:val="22"/>
-          <w:szCs w:val="22"/>
+          <w:sz w:val="24"/>
+          <w:szCs w:val="24"/>
         </w:rPr>
         <w:t xml:space="preserve">06.  DOUBLE EMPLOYMENT / OFFICE OF THE PROFIT:</w:t>
       </w:r>
@@ -295,8 +307,8 @@
         <w:rPr>
           <w:rFonts w:ascii="Verdana" w:cs="Verdana" w:eastAsia="Verdana" w:hAnsi="Verdana"/>
           <w:color w:val="000000"/>
-          <w:sz w:val="22"/>
-          <w:szCs w:val="22"/>
+          <w:sz w:val="24"/>
+          <w:szCs w:val="24"/>
         </w:rPr>
         <w:t xml:space="preserve">Company's employees are whole time employees and they should not carry out any other job / employment or hold any other honorary office during the tenure of such employment. In the event, the Company finds that You have engaged in Double Employment, the Company shall be entitled to forthwith terminate Your Employment with immediate effect as per Clause 10. Further, You shall be liable to pay to the Company, the salary received by You from the Company, for the period for which You have engaged in the said Double Employment.</w:t>
       </w:r>
@@ -304,6 +316,7 @@
     <w:p>
       <w:pPr>
         <w:spacing w:after="40" w:before="120" w:line="276" w:lineRule="auto"/>
+        <w:jc w:val="both"/>
       </w:pPr>
       <w:r>
         <w:rPr>
@@ -311,8 +324,8 @@
           <w:b/>
           <w:bCs/>
           <w:color w:val="000000"/>
-          <w:sz w:val="22"/>
-          <w:szCs w:val="22"/>
+          <w:sz w:val="24"/>
+          <w:szCs w:val="24"/>
         </w:rPr>
         <w:t xml:space="preserve">07.  SERVICE RULES</w:t>
       </w:r>
@@ -326,8 +339,8 @@
         <w:rPr>
           <w:rFonts w:ascii="Verdana" w:cs="Verdana" w:eastAsia="Verdana" w:hAnsi="Verdana"/>
           <w:color w:val="000000"/>
-          <w:sz w:val="22"/>
-          <w:szCs w:val="22"/>
+          <w:sz w:val="24"/>
+          <w:szCs w:val="24"/>
         </w:rPr>
         <w:t xml:space="preserve">You will be governed by the service rules and regulations including conduct, discipline and any such other rules or orders of the Company that may come in force from time to time.</w:t>
       </w:r>
@@ -335,6 +348,7 @@
     <w:p>
       <w:pPr>
         <w:spacing w:after="40" w:before="120" w:line="276" w:lineRule="auto"/>
+        <w:jc w:val="both"/>
       </w:pPr>
       <w:r>
         <w:rPr>
@@ -342,8 +356,8 @@
           <w:b/>
           <w:bCs/>
           <w:color w:val="000000"/>
-          <w:sz w:val="22"/>
-          <w:szCs w:val="22"/>
+          <w:sz w:val="24"/>
+          <w:szCs w:val="24"/>
         </w:rPr>
         <w:t xml:space="preserve">08.  CONFIDENTIALITY</w:t>
       </w:r>
@@ -358,8 +372,8 @@
         <w:rPr>
           <w:rFonts w:ascii="Verdana" w:cs="Verdana" w:eastAsia="Verdana" w:hAnsi="Verdana"/>
           <w:color w:val="000000"/>
-          <w:sz w:val="22"/>
-          <w:szCs w:val="22"/>
+          <w:sz w:val="24"/>
+          <w:szCs w:val="24"/>
         </w:rPr>
         <w:t xml:space="preserve">8.1  The contents of the Agreement and any information passed on by the Company to You ("Confidential Information") is highly confidential in nature and You agree and undertake to maintain the confidentiality of the information. All program(s), designs, modules, projects, manuals, literature or any new project(s) dealt / developed by You, during Your appointment shall be deemed to be the sole property of the Company and also be regarded as Confidential Information.</w:t>
       </w:r>
@@ -374,8 +388,8 @@
         <w:rPr>
           <w:rFonts w:ascii="Verdana" w:cs="Verdana" w:eastAsia="Verdana" w:hAnsi="Verdana"/>
           <w:color w:val="000000"/>
-          <w:sz w:val="22"/>
-          <w:szCs w:val="22"/>
+          <w:sz w:val="24"/>
+          <w:szCs w:val="24"/>
         </w:rPr>
         <w:t xml:space="preserve">8.2  You shall ensure that the Confidential Information is not disclosed directly or indirectly to any person/ company/ firm and shall not use the Confidential Information for any purpose other than this Agreement.</w:t>
       </w:r>
@@ -390,8 +404,8 @@
         <w:rPr>
           <w:rFonts w:ascii="Verdana" w:cs="Verdana" w:eastAsia="Verdana" w:hAnsi="Verdana"/>
           <w:color w:val="000000"/>
-          <w:sz w:val="22"/>
-          <w:szCs w:val="22"/>
+          <w:sz w:val="24"/>
+          <w:szCs w:val="24"/>
         </w:rPr>
         <w:t xml:space="preserve">8.3  You agree that the unauthorized disclosure or use of such information would cause irreparable harm and significant injury to the Company, the degree of which may be difficult to ascertain. Accordingly, you agree that the Company shall have the right to obtain an immediate injunction from any court of law ensuing breach of this Agreement and/or disclosure of the Confidential Information. The Company shall also have the right to pursue any other rights or remedies available at law or equity for such a breach.</w:t>
       </w:r>
@@ -406,8 +420,8 @@
         <w:rPr>
           <w:rFonts w:ascii="Verdana" w:cs="Verdana" w:eastAsia="Verdana" w:hAnsi="Verdana"/>
           <w:color w:val="000000"/>
-          <w:sz w:val="22"/>
-          <w:szCs w:val="22"/>
+          <w:sz w:val="24"/>
+          <w:szCs w:val="24"/>
         </w:rPr>
         <w:t xml:space="preserve">8.4  The provisions of this Clause shall survive the termination of your Appointment.</w:t>
       </w:r>
@@ -415,6 +429,7 @@
     <w:p>
       <w:pPr>
         <w:spacing w:after="40" w:before="120" w:line="276" w:lineRule="auto"/>
+        <w:jc w:val="both"/>
       </w:pPr>
       <w:r>
         <w:rPr>
@@ -422,8 +437,8 @@
           <w:b/>
           <w:bCs/>
           <w:color w:val="000000"/>
-          <w:sz w:val="22"/>
-          <w:szCs w:val="22"/>
+          <w:sz w:val="24"/>
+          <w:szCs w:val="24"/>
         </w:rPr>
         <w:t xml:space="preserve">09.  MEDICAL FITNESS:</w:t>
       </w:r>
@@ -437,8 +452,8 @@
         <w:rPr>
           <w:rFonts w:ascii="Verdana" w:cs="Verdana" w:eastAsia="Verdana" w:hAnsi="Verdana"/>
           <w:color w:val="000000"/>
-          <w:sz w:val="22"/>
-          <w:szCs w:val="22"/>
+          <w:sz w:val="24"/>
+          <w:szCs w:val="24"/>
         </w:rPr>
         <w:t xml:space="preserve">You are required to submit a Medical Fitness Certificate certified by a Medical Practitioner at the time of joining.</w:t>
       </w:r>
@@ -446,6 +461,7 @@
     <w:p>
       <w:pPr>
         <w:spacing w:after="40" w:before="120" w:line="276" w:lineRule="auto"/>
+        <w:jc w:val="both"/>
       </w:pPr>
       <w:r>
         <w:rPr>
@@ -453,8 +469,8 @@
           <w:b/>
           <w:bCs/>
           <w:color w:val="000000"/>
-          <w:sz w:val="22"/>
-          <w:szCs w:val="22"/>
+          <w:sz w:val="24"/>
+          <w:szCs w:val="24"/>
         </w:rPr>
         <w:t xml:space="preserve">10.  TERMINATION:</w:t>
       </w:r>
@@ -469,8 +485,8 @@
         <w:rPr>
           <w:rFonts w:ascii="Verdana" w:cs="Verdana" w:eastAsia="Verdana" w:hAnsi="Verdana"/>
           <w:color w:val="000000"/>
-          <w:sz w:val="22"/>
-          <w:szCs w:val="22"/>
+          <w:sz w:val="24"/>
+          <w:szCs w:val="24"/>
         </w:rPr>
         <w:t xml:space="preserve">A.  During Probation Period:</w:t>
       </w:r>
@@ -485,8 +501,8 @@
         <w:rPr>
           <w:rFonts w:ascii="Verdana" w:cs="Verdana" w:eastAsia="Verdana" w:hAnsi="Verdana"/>
           <w:color w:val="000000"/>
-          <w:sz w:val="22"/>
-          <w:szCs w:val="22"/>
+          <w:sz w:val="24"/>
+          <w:szCs w:val="24"/>
         </w:rPr>
         <w:t xml:space="preserve">a)  Your services can be terminated by giving 30 days' notice or payment of 30-days gross salary.</w:t>
       </w:r>
@@ -501,8 +517,8 @@
         <w:rPr>
           <w:rFonts w:ascii="Verdana" w:cs="Verdana" w:eastAsia="Verdana" w:hAnsi="Verdana"/>
           <w:color w:val="000000"/>
-          <w:sz w:val="22"/>
-          <w:szCs w:val="22"/>
+          <w:sz w:val="24"/>
+          <w:szCs w:val="24"/>
         </w:rPr>
         <w:t xml:space="preserve">b)  In case you decide to leave the company, you are required to give the company a notice period of 30-days (or) payment of an amount equivalent to 30-day's gross monthly salary.</w:t>
       </w:r>
@@ -517,8 +533,8 @@
         <w:rPr>
           <w:rFonts w:ascii="Verdana" w:cs="Verdana" w:eastAsia="Verdana" w:hAnsi="Verdana"/>
           <w:color w:val="000000"/>
-          <w:sz w:val="22"/>
-          <w:szCs w:val="22"/>
+          <w:sz w:val="24"/>
+          <w:szCs w:val="24"/>
         </w:rPr>
         <w:t xml:space="preserve">c)  In the event, the Company is not satisfied with your performance, the Company shall be entitled to terminate your services immediately without any notice.</w:t>
       </w:r>
@@ -533,8 +549,8 @@
         <w:rPr>
           <w:rFonts w:ascii="Verdana" w:cs="Verdana" w:eastAsia="Verdana" w:hAnsi="Verdana"/>
           <w:color w:val="000000"/>
-          <w:sz w:val="22"/>
-          <w:szCs w:val="22"/>
+          <w:sz w:val="24"/>
+          <w:szCs w:val="24"/>
         </w:rPr>
         <w:t xml:space="preserve">B.  On confirmation:</w:t>
       </w:r>
@@ -549,8 +565,8 @@
         <w:rPr>
           <w:rFonts w:ascii="Verdana" w:cs="Verdana" w:eastAsia="Verdana" w:hAnsi="Verdana"/>
           <w:color w:val="000000"/>
-          <w:sz w:val="22"/>
-          <w:szCs w:val="22"/>
+          <w:sz w:val="24"/>
+          <w:szCs w:val="24"/>
         </w:rPr>
         <w:t xml:space="preserve">Your services can be terminated by the Company by giving three month's notice or payment of three month's gross salary in lieu thereof. You shall be entitled to leave the Company by giving the Company prior notice of three months (or) upon payment of an amount equivalent to three months' gross monthly salary. However, on your resignation, the Company in its sole discretion will have an option to accept the same and relieve you prior to the completion of the notice period of three months without any pay in lieu of notice period.</w:t>
       </w:r>
@@ -565,8 +581,8 @@
         <w:rPr>
           <w:rFonts w:ascii="Verdana" w:cs="Verdana" w:eastAsia="Verdana" w:hAnsi="Verdana"/>
           <w:color w:val="000000"/>
-          <w:sz w:val="22"/>
-          <w:szCs w:val="22"/>
+          <w:sz w:val="24"/>
+          <w:szCs w:val="24"/>
         </w:rPr>
         <w:t xml:space="preserve">Note: Your services are terminated by the company with immediate effect in case of disciplinary, non-performance and ethical matters in probation period and on confirmation of employment.</w:t>
       </w:r>
@@ -574,6 +590,7 @@
     <w:p>
       <w:pPr>
         <w:spacing w:after="40" w:before="120" w:line="276" w:lineRule="auto"/>
+        <w:jc w:val="both"/>
       </w:pPr>
       <w:r>
         <w:rPr>
@@ -581,8 +598,8 @@
           <w:b/>
           <w:bCs/>
           <w:color w:val="000000"/>
-          <w:sz w:val="22"/>
-          <w:szCs w:val="22"/>
+          <w:sz w:val="24"/>
+          <w:szCs w:val="24"/>
         </w:rPr>
         <w:t xml:space="preserve">11.  RETIREMENT FROM SERVICES:</w:t>
       </w:r>
@@ -596,8 +613,8 @@
         <w:rPr>
           <w:rFonts w:ascii="Verdana" w:cs="Verdana" w:eastAsia="Verdana" w:hAnsi="Verdana"/>
           <w:color w:val="000000"/>
-          <w:sz w:val="22"/>
-          <w:szCs w:val="22"/>
+          <w:sz w:val="24"/>
+          <w:szCs w:val="24"/>
         </w:rPr>
         <w:t xml:space="preserve">You will automatically retire from the services of the company on attaining the superannuating age of 58 years.</w:t>
       </w:r>
@@ -605,6 +622,7 @@
     <w:p>
       <w:pPr>
         <w:spacing w:after="40" w:before="120" w:line="276" w:lineRule="auto"/>
+        <w:jc w:val="both"/>
       </w:pPr>
       <w:r>
         <w:rPr>
@@ -612,8 +630,8 @@
           <w:b/>
           <w:bCs/>
           <w:color w:val="000000"/>
-          <w:sz w:val="22"/>
-          <w:szCs w:val="22"/>
+          <w:sz w:val="24"/>
+          <w:szCs w:val="24"/>
         </w:rPr>
         <w:t xml:space="preserve">12.  INDEMNITY:</w:t>
       </w:r>
@@ -627,8 +645,8 @@
         <w:rPr>
           <w:rFonts w:ascii="Verdana" w:cs="Verdana" w:eastAsia="Verdana" w:hAnsi="Verdana"/>
           <w:color w:val="000000"/>
-          <w:sz w:val="22"/>
-          <w:szCs w:val="22"/>
+          <w:sz w:val="24"/>
+          <w:szCs w:val="24"/>
         </w:rPr>
         <w:t xml:space="preserve">You agree to indemnify and keep safe the Company from and against claims, demands, actions, liabilities, costs, interest, damages and expenses of any nature whatsoever (including all legal and other costs, charges and expenses) incurred or suffered by the Company, arising out of any (a) Your wrongful or negligent act or omission of the Consultant; (b) any breach of Your obligations under this Agreement; and, (c) breach of any applicable laws/ terms or this Agreement by You, by reason of any actions undertaken by You arising out of his obligations under this Agreement.</w:t>
       </w:r>
@@ -636,6 +654,7 @@
     <w:p>
       <w:pPr>
         <w:spacing w:after="40" w:before="120" w:line="276" w:lineRule="auto"/>
+        <w:jc w:val="both"/>
       </w:pPr>
       <w:r>
         <w:rPr>
@@ -643,8 +662,8 @@
           <w:b/>
           <w:bCs/>
           <w:color w:val="000000"/>
-          <w:sz w:val="22"/>
-          <w:szCs w:val="22"/>
+          <w:sz w:val="24"/>
+          <w:szCs w:val="24"/>
         </w:rPr>
         <w:t xml:space="preserve">13.  ABANDONMENT:</w:t>
       </w:r>
@@ -658,8 +677,8 @@
         <w:rPr>
           <w:rFonts w:ascii="Verdana" w:cs="Verdana" w:eastAsia="Verdana" w:hAnsi="Verdana"/>
           <w:color w:val="000000"/>
-          <w:sz w:val="22"/>
-          <w:szCs w:val="22"/>
+          <w:sz w:val="24"/>
+          <w:szCs w:val="24"/>
         </w:rPr>
         <w:t xml:space="preserve">Any unauthorized absence from work for a continuous period of 5 working days (including absence upon leave applied for but not granted), shall automatically terminate your employment without any notice obligation on the company.</w:t>
       </w:r>
@@ -667,6 +686,7 @@
     <w:p>
       <w:pPr>
         <w:spacing w:after="40" w:before="120" w:line="276" w:lineRule="auto"/>
+        <w:jc w:val="both"/>
       </w:pPr>
       <w:r>
         <w:rPr>
@@ -674,8 +694,8 @@
           <w:b/>
           <w:bCs/>
           <w:color w:val="000000"/>
-          <w:sz w:val="22"/>
-          <w:szCs w:val="22"/>
+          <w:sz w:val="24"/>
+          <w:szCs w:val="24"/>
         </w:rPr>
         <w:t xml:space="preserve">14.  VARIABLE PAY:</w:t>
       </w:r>
@@ -689,8 +709,8 @@
         <w:rPr>
           <w:rFonts w:ascii="Verdana" w:cs="Verdana" w:eastAsia="Verdana" w:hAnsi="Verdana"/>
           <w:color w:val="000000"/>
-          <w:sz w:val="22"/>
-          <w:szCs w:val="22"/>
+          <w:sz w:val="24"/>
+          <w:szCs w:val="24"/>
         </w:rPr>
         <w:t xml:space="preserve">Employee should be active and not serving notice period at the time of disbursement of Variable Pay. Variable Pay will be disbursed on completion of one-year service with the Company. Variable Pay will be paid based on Individual and Company performance.</w:t>
       </w:r>
@@ -698,6 +718,7 @@
     <w:p>
       <w:pPr>
         <w:spacing w:after="40" w:before="120" w:line="276" w:lineRule="auto"/>
+        <w:jc w:val="both"/>
       </w:pPr>
       <w:r>
         <w:rPr>
@@ -705,8 +726,8 @@
           <w:b/>
           <w:bCs/>
           <w:color w:val="000000"/>
-          <w:sz w:val="22"/>
-          <w:szCs w:val="22"/>
+          <w:sz w:val="24"/>
+          <w:szCs w:val="24"/>
         </w:rPr>
         <w:t xml:space="preserve">15.  GENERAL</w:t>
       </w:r>
@@ -721,8 +742,8 @@
         <w:rPr>
           <w:rFonts w:ascii="Verdana" w:cs="Verdana" w:eastAsia="Verdana" w:hAnsi="Verdana"/>
           <w:color w:val="000000"/>
-          <w:sz w:val="22"/>
-          <w:szCs w:val="22"/>
+          <w:sz w:val="24"/>
+          <w:szCs w:val="24"/>
         </w:rPr>
         <w:t xml:space="preserve">a)  The company will deduct all applicable Taxes and you will be responsible for your Tax liabilities under all applicable Tax Laws and Regulations.</w:t>
       </w:r>
@@ -737,8 +758,8 @@
         <w:rPr>
           <w:rFonts w:ascii="Verdana" w:cs="Verdana" w:eastAsia="Verdana" w:hAnsi="Verdana"/>
           <w:color w:val="000000"/>
-          <w:sz w:val="22"/>
-          <w:szCs w:val="22"/>
+          <w:sz w:val="24"/>
+          <w:szCs w:val="24"/>
         </w:rPr>
         <w:t xml:space="preserve">b)  In case particulars mentioned in your application are found be false, your services would be liable for termination at any time without assigning any reason or notice or compensation in lieu thereof.</w:t>
       </w:r>
@@ -753,8 +774,8 @@
         <w:rPr>
           <w:rFonts w:ascii="Verdana" w:cs="Verdana" w:eastAsia="Verdana" w:hAnsi="Verdana"/>
           <w:color w:val="000000"/>
-          <w:sz w:val="22"/>
-          <w:szCs w:val="22"/>
+          <w:sz w:val="24"/>
+          <w:szCs w:val="24"/>
         </w:rPr>
         <w:t xml:space="preserve">c)  During the course of your employment, in the event of being found guilty of misconduct, commit any breach of the terms of your employment or any other act of omission, you are liable for termination of your services without any notice or compensation.</w:t>
       </w:r>
@@ -769,8 +790,8 @@
         <w:rPr>
           <w:rFonts w:ascii="Verdana" w:cs="Verdana" w:eastAsia="Verdana" w:hAnsi="Verdana"/>
           <w:color w:val="000000"/>
-          <w:sz w:val="22"/>
-          <w:szCs w:val="22"/>
+          <w:sz w:val="24"/>
+          <w:szCs w:val="24"/>
         </w:rPr>
         <w:t xml:space="preserve">d)  You will be required to effectively carry out all duties and responsibilities assigned to you by your manager and others authorized by the Company to assign such duties and responsibilities. Your performance will be subject to periodic appraisal by your manager.</w:t>
       </w:r>
@@ -785,8 +806,8 @@
         <w:rPr>
           <w:rFonts w:ascii="Verdana" w:cs="Verdana" w:eastAsia="Verdana" w:hAnsi="Verdana"/>
           <w:color w:val="000000"/>
-          <w:sz w:val="22"/>
-          <w:szCs w:val="22"/>
+          <w:sz w:val="24"/>
+          <w:szCs w:val="24"/>
         </w:rPr>
         <w:t xml:space="preserve">e)  You acknowledge and agree that it would be impossible or extremely difficult to exactly quantify the loss incurred by the Company as a result of breach of terms and conditions of this Offer Letter by you, therefore the Parties mutually agree that you shall pay actual cost of loss/damages to the Company as liquidated damages for such losses incurred by the Company as result of breach of terms and conditions of this Offer Letter by you.</w:t>
       </w:r>
@@ -801,8 +822,8 @@
         <w:rPr>
           <w:rFonts w:ascii="Verdana" w:cs="Verdana" w:eastAsia="Verdana" w:hAnsi="Verdana"/>
           <w:color w:val="000000"/>
-          <w:sz w:val="22"/>
-          <w:szCs w:val="22"/>
+          <w:sz w:val="24"/>
+          <w:szCs w:val="24"/>
         </w:rPr>
         <w:t xml:space="preserve">f)  You should be prepared to work on any shift, as may be warranted by the Company's or Client's work requirements. Depending on organizational requirement or project contingencies your working hours' / work days may be modified/ altered from time to time.</w:t>
       </w:r>
@@ -817,8 +838,8 @@
         <w:rPr>
           <w:rFonts w:ascii="Verdana" w:cs="Verdana" w:eastAsia="Verdana" w:hAnsi="Verdana"/>
           <w:color w:val="000000"/>
-          <w:sz w:val="22"/>
-          <w:szCs w:val="22"/>
+          <w:sz w:val="24"/>
+          <w:szCs w:val="24"/>
         </w:rPr>
         <w:t xml:space="preserve">g)  In case of any change in your residential address during your employment, it shall be your duty to intimate the same to the HR Department in writing within three days from the date of such change. All notices mailed to you by the Company to the last address given by you shall be deemed to have been received by you.</w:t>
       </w:r>
@@ -833,8 +854,8 @@
         <w:rPr>
           <w:rFonts w:ascii="Verdana" w:cs="Verdana" w:eastAsia="Verdana" w:hAnsi="Verdana"/>
           <w:color w:val="000000"/>
-          <w:sz w:val="22"/>
-          <w:szCs w:val="22"/>
+          <w:sz w:val="24"/>
+          <w:szCs w:val="24"/>
         </w:rPr>
         <w:t xml:space="preserve">h)  The work timings are at the sole discretion of the Management and would normally consist of a 45 hours workweek. These are subject to changes, as per business requirements.</w:t>
       </w:r>
@@ -849,8 +870,8 @@
         <w:rPr>
           <w:rFonts w:ascii="Verdana" w:cs="Verdana" w:eastAsia="Verdana" w:hAnsi="Verdana"/>
           <w:color w:val="000000"/>
-          <w:sz w:val="22"/>
-          <w:szCs w:val="22"/>
+          <w:sz w:val="24"/>
+          <w:szCs w:val="24"/>
         </w:rPr>
         <w:t xml:space="preserve">i)  The Company shall be entitled to carry out a background check in relation to your past employments and you shall assist the Company by providing all such information as may be required in this connection.</w:t>
       </w:r>
@@ -865,8 +886,8 @@
         <w:rPr>
           <w:rFonts w:ascii="Verdana" w:cs="Verdana" w:eastAsia="Verdana" w:hAnsi="Verdana"/>
           <w:color w:val="000000"/>
-          <w:sz w:val="22"/>
-          <w:szCs w:val="22"/>
+          <w:sz w:val="24"/>
+          <w:szCs w:val="24"/>
         </w:rPr>
         <w:t xml:space="preserve">j)  This Offer Letter shall be governed and construed under the laws of India. Any disputes or differences arising out of or pertaining to this Offer Letter shall be subject to the exclusive jurisdiction of the competent Courts at Hyderabad, Telangana.</w:t>
       </w:r>
@@ -874,19 +895,20 @@
     <w:p>
       <w:pPr>
         <w:spacing w:after="80" w:before="0" w:line="276" w:lineRule="auto"/>
-      </w:pPr>
-    </w:p>
-    <w:p>
-      <w:pPr>
-        <w:spacing w:after="80" w:before="0" w:line="276" w:lineRule="auto"/>
-        <w:jc w:val="both"/>
-      </w:pPr>
-      <w:r>
-        <w:rPr>
-          <w:rFonts w:ascii="Verdana" w:cs="Verdana" w:eastAsia="Verdana" w:hAnsi="Verdana"/>
-          <w:color w:val="000000"/>
-          <w:sz w:val="22"/>
-          <w:szCs w:val="22"/>
+        <w:jc w:val="both"/>
+      </w:pPr>
+    </w:p>
+    <w:p>
+      <w:pPr>
+        <w:spacing w:after="80" w:before="0" w:line="276" w:lineRule="auto"/>
+        <w:jc w:val="both"/>
+      </w:pPr>
+      <w:r>
+        <w:rPr>
+          <w:rFonts w:ascii="Verdana" w:cs="Verdana" w:eastAsia="Verdana" w:hAnsi="Verdana"/>
+          <w:color w:val="000000"/>
+          <w:sz w:val="24"/>
+          <w:szCs w:val="24"/>
         </w:rPr>
         <w:t xml:space="preserve">We look forward for a long and mutually rewarding association.</w:t>
       </w:r>
@@ -894,19 +916,20 @@
     <w:p>
       <w:pPr>
         <w:spacing w:after="80" w:before="0" w:line="276" w:lineRule="auto"/>
-      </w:pPr>
-    </w:p>
-    <w:p>
-      <w:pPr>
-        <w:spacing w:after="80" w:before="0" w:line="276" w:lineRule="auto"/>
-        <w:jc w:val="both"/>
-      </w:pPr>
-      <w:r>
-        <w:rPr>
-          <w:rFonts w:ascii="Verdana" w:cs="Verdana" w:eastAsia="Verdana" w:hAnsi="Verdana"/>
-          <w:color w:val="000000"/>
-          <w:sz w:val="22"/>
-          <w:szCs w:val="22"/>
+        <w:jc w:val="both"/>
+      </w:pPr>
+    </w:p>
+    <w:p>
+      <w:pPr>
+        <w:spacing w:after="80" w:before="0" w:line="276" w:lineRule="auto"/>
+        <w:jc w:val="both"/>
+      </w:pPr>
+      <w:r>
+        <w:rPr>
+          <w:rFonts w:ascii="Verdana" w:cs="Verdana" w:eastAsia="Verdana" w:hAnsi="Verdana"/>
+          <w:color w:val="000000"/>
+          <w:sz w:val="24"/>
+          <w:szCs w:val="24"/>
         </w:rPr>
         <w:t xml:space="preserve">Sincerely,</w:t>
       </w:r>
@@ -914,11 +937,13 @@
     <w:p>
       <w:pPr>
         <w:spacing w:after="120" w:before="0" w:line="276" w:lineRule="auto"/>
+        <w:jc w:val="both"/>
       </w:pPr>
     </w:p>
     <w:p>
       <w:pPr>
         <w:spacing w:after="0" w:before="0" w:line="276" w:lineRule="auto"/>
+        <w:jc w:val="both"/>
       </w:pPr>
       <w:r>
         <w:rPr>
@@ -926,8 +951,8 @@
           <w:b/>
           <w:bCs/>
           <w:color w:val="000000"/>
-          <w:sz w:val="22"/>
-          <w:szCs w:val="22"/>
+          <w:sz w:val="24"/>
+          <w:szCs w:val="24"/>
         </w:rPr>
         <w:t xml:space="preserve">HR Manager</w:t>
       </w:r>
@@ -935,13 +960,14 @@
     <w:p>
       <w:pPr>
         <w:spacing w:after="80" w:before="0" w:line="276" w:lineRule="auto"/>
-      </w:pPr>
-      <w:r>
-        <w:rPr>
-          <w:rFonts w:ascii="Verdana" w:cs="Verdana" w:eastAsia="Verdana" w:hAnsi="Verdana"/>
-          <w:color w:val="000000"/>
-          <w:sz w:val="22"/>
-          <w:szCs w:val="22"/>
+        <w:jc w:val="both"/>
+      </w:pPr>
+      <w:r>
+        <w:rPr>
+          <w:rFonts w:ascii="Verdana" w:cs="Verdana" w:eastAsia="Verdana" w:hAnsi="Verdana"/>
+          <w:color w:val="000000"/>
+          <w:sz w:val="24"/>
+          <w:szCs w:val="24"/>
         </w:rPr>
         <w:t xml:space="preserve">{{CompanyName}}</w:t>
       </w:r>
@@ -949,6 +975,7 @@
     <w:p>
       <w:pPr>
         <w:spacing w:after="80" w:before="0" w:line="276" w:lineRule="auto"/>
+        <w:jc w:val="both"/>
       </w:pPr>
     </w:p>
     <w:tbl>
@@ -992,8 +1019,8 @@
                 <w:b/>
                 <w:bCs/>
                 <w:color w:val="000000"/>
-                <w:sz w:val="22"/>
-                <w:szCs w:val="22"/>
+                <w:sz w:val="24"/>
+                <w:szCs w:val="24"/>
               </w:rPr>
               <w:t xml:space="preserve">Acceptance</w:t>
             </w:r>
@@ -1007,8 +1034,8 @@
               <w:rPr>
                 <w:rFonts w:ascii="Verdana" w:cs="Verdana" w:eastAsia="Verdana" w:hAnsi="Verdana"/>
                 <w:color w:val="000000"/>
-                <w:sz w:val="22"/>
-                <w:szCs w:val="22"/>
+                <w:sz w:val="24"/>
+                <w:szCs w:val="24"/>
               </w:rPr>
               <w:t xml:space="preserve">I have read and understood the above Terms &amp; Conditions hereby signify my acceptance. I would be joining the duties on </w:t>
             </w:r>
@@ -1016,8 +1043,8 @@
               <w:rPr>
                 <w:rFonts w:ascii="Verdana" w:cs="Verdana" w:eastAsia="Verdana" w:hAnsi="Verdana"/>
                 <w:color w:val="000000"/>
-                <w:sz w:val="22"/>
-                <w:szCs w:val="22"/>
+                <w:sz w:val="24"/>
+                <w:szCs w:val="24"/>
                 <w:u w:val="single"/>
               </w:rPr>
               <w:t xml:space="preserve">__________________</w:t>
@@ -1026,8 +1053,8 @@
               <w:rPr>
                 <w:rFonts w:ascii="Verdana" w:cs="Verdana" w:eastAsia="Verdana" w:hAnsi="Verdana"/>
                 <w:color w:val="000000"/>
-                <w:sz w:val="22"/>
-                <w:szCs w:val="22"/>
+                <w:sz w:val="24"/>
+                <w:szCs w:val="24"/>
               </w:rPr>
               <w:t xml:space="preserve">.</w:t>
             </w:r>
@@ -1045,8 +1072,8 @@
               <w:rPr>
                 <w:rFonts w:ascii="Verdana" w:cs="Verdana" w:eastAsia="Verdana" w:hAnsi="Verdana"/>
                 <w:color w:val="000000"/>
-                <w:sz w:val="22"/>
-                <w:szCs w:val="22"/>
+                <w:sz w:val="24"/>
+                <w:szCs w:val="24"/>
               </w:rPr>
               <w:t xml:space="preserve">Name    : </w:t>
             </w:r>
@@ -1062,16 +1089,16 @@
               <w:rPr>
                 <w:rFonts w:ascii="Verdana" w:cs="Verdana" w:eastAsia="Verdana" w:hAnsi="Verdana"/>
                 <w:color w:val="000000"/>
-                <w:sz w:val="22"/>
-                <w:szCs w:val="22"/>
+                <w:sz w:val="24"/>
+                <w:szCs w:val="24"/>
               </w:rPr>
               <w:t xml:space="preserve">Signature :</w:t>
             </w:r>
             <w:r>
               <w:rPr>
                 <w:rFonts w:ascii="Verdana" w:cs="Verdana" w:eastAsia="Verdana" w:hAnsi="Verdana"/>
-                <w:sz w:val="22"/>
-                <w:szCs w:val="22"/>
+                <w:sz w:val="24"/>
+                <w:szCs w:val="24"/>
               </w:rPr>
               <w:t xml:space="preserve">	</w:t>
             </w:r>
@@ -1079,8 +1106,8 @@
               <w:rPr>
                 <w:rFonts w:ascii="Verdana" w:cs="Verdana" w:eastAsia="Verdana" w:hAnsi="Verdana"/>
                 <w:color w:val="000000"/>
-                <w:sz w:val="22"/>
-                <w:szCs w:val="22"/>
+                <w:sz w:val="24"/>
+                <w:szCs w:val="24"/>
               </w:rPr>
               <w:t xml:space="preserve">Date :</w:t>
             </w:r>
@@ -1091,6 +1118,7 @@
     <w:p>
       <w:pPr>
         <w:spacing w:after="80" w:before="0" w:line="276" w:lineRule="auto"/>
+        <w:jc w:val="both"/>
       </w:pPr>
     </w:p>
     <w:tbl>
@@ -1134,8 +1162,8 @@
                 <w:b/>
                 <w:bCs/>
                 <w:color w:val="000000"/>
-                <w:sz w:val="22"/>
-                <w:szCs w:val="22"/>
+                <w:sz w:val="24"/>
+                <w:szCs w:val="24"/>
               </w:rPr>
               <w:t xml:space="preserve">Report to</w:t>
             </w:r>
@@ -1148,8 +1176,8 @@
               <w:rPr>
                 <w:rFonts w:ascii="Verdana" w:cs="Verdana" w:eastAsia="Verdana" w:hAnsi="Verdana"/>
                 <w:color w:val="000000"/>
-                <w:sz w:val="22"/>
-                <w:szCs w:val="22"/>
+                <w:sz w:val="24"/>
+                <w:szCs w:val="24"/>
               </w:rPr>
               <w:t xml:space="preserve">{{ReportTo}}.</w:t>
             </w:r>
@@ -1161,12 +1189,13 @@
       <w:pPr>
         <w:pageBreakBefore/>
         <w:spacing w:after="0" w:before="0" w:line="276" w:lineRule="auto"/>
-      </w:pPr>
-      <w:r>
-        <w:rPr>
-          <w:rFonts w:ascii="Verdana" w:cs="Verdana" w:eastAsia="Verdana" w:hAnsi="Verdana"/>
-          <w:sz w:val="22"/>
-          <w:szCs w:val="22"/>
+        <w:jc w:val="both"/>
+      </w:pPr>
+      <w:r>
+        <w:rPr>
+          <w:rFonts w:ascii="Verdana" w:cs="Verdana" w:eastAsia="Verdana" w:hAnsi="Verdana"/>
+          <w:sz w:val="24"/>
+          <w:szCs w:val="24"/>
         </w:rPr>
         <w:t xml:space="preserve"/>
       </w:r>
@@ -1174,6 +1203,7 @@
     <w:p>
       <w:pPr>
         <w:spacing w:after="160" w:before="0" w:line="276" w:lineRule="auto"/>
+        <w:jc w:val="both"/>
       </w:pPr>
       <w:r>
         <w:rPr>
@@ -1190,6 +1220,7 @@
     <w:p>
       <w:pPr>
         <w:spacing w:after="80" w:before="0" w:line="276" w:lineRule="auto"/>
+        <w:jc w:val="both"/>
       </w:pPr>
     </w:p>
     <w:tbl>
@@ -1225,6 +1256,7 @@
           </w:tcPr>
           <w:p>
             <w:pPr>
+              <w:jc w:val="right"/>
               <w:spacing w:after="0" w:before="0" w:line="276" w:lineRule="auto"/>
             </w:pPr>
             <w:r>
@@ -1233,8 +1265,8 @@
                 <w:b/>
                 <w:bCs/>
                 <w:color w:val="000000"/>
-                <w:sz w:val="22"/>
-                <w:szCs w:val="22"/>
+                <w:sz w:val="24"/>
+                <w:szCs w:val="24"/>
               </w:rPr>
               <w:t xml:space="preserve">List of Documents / Information to be submitted on Date Of Joining to facilitate Joining, Background verification / Validation and Appointment process at {{CompanyName}}</w:t>
             </w:r>
@@ -1254,8 +1286,8 @@
           <w:b/>
           <w:bCs/>
           <w:color w:val="000000"/>
-          <w:sz w:val="22"/>
-          <w:szCs w:val="22"/>
+          <w:sz w:val="24"/>
+          <w:szCs w:val="24"/>
         </w:rPr>
         <w:t xml:space="preserve">1.  </w:t>
       </w:r>
@@ -1263,8 +1295,8 @@
         <w:rPr>
           <w:rFonts w:ascii="Verdana" w:cs="Verdana" w:eastAsia="Verdana" w:hAnsi="Verdana"/>
           <w:color w:val="000000"/>
-          <w:sz w:val="22"/>
-          <w:szCs w:val="22"/>
+          <w:sz w:val="24"/>
+          <w:szCs w:val="24"/>
         </w:rPr>
         <w:t xml:space="preserve">1 copy of this Offer letter duly signed and dated by you</w:t>
       </w:r>
@@ -1281,8 +1313,8 @@
           <w:b/>
           <w:bCs/>
           <w:color w:val="000000"/>
-          <w:sz w:val="22"/>
-          <w:szCs w:val="22"/>
+          <w:sz w:val="24"/>
+          <w:szCs w:val="24"/>
         </w:rPr>
         <w:t xml:space="preserve">2.  </w:t>
       </w:r>
@@ -1290,8 +1322,8 @@
         <w:rPr>
           <w:rFonts w:ascii="Verdana" w:cs="Verdana" w:eastAsia="Verdana" w:hAnsi="Verdana"/>
           <w:color w:val="000000"/>
-          <w:sz w:val="22"/>
-          <w:szCs w:val="22"/>
+          <w:sz w:val="24"/>
+          <w:szCs w:val="24"/>
         </w:rPr>
         <w:t xml:space="preserve">Passport sized photographs - 2</w:t>
       </w:r>
@@ -1308,8 +1340,8 @@
           <w:b/>
           <w:bCs/>
           <w:color w:val="000000"/>
-          <w:sz w:val="22"/>
-          <w:szCs w:val="22"/>
+          <w:sz w:val="24"/>
+          <w:szCs w:val="24"/>
         </w:rPr>
         <w:t xml:space="preserve">3.  </w:t>
       </w:r>
@@ -1317,8 +1349,8 @@
         <w:rPr>
           <w:rFonts w:ascii="Verdana" w:cs="Verdana" w:eastAsia="Verdana" w:hAnsi="Verdana"/>
           <w:color w:val="000000"/>
-          <w:sz w:val="22"/>
-          <w:szCs w:val="22"/>
+          <w:sz w:val="24"/>
+          <w:szCs w:val="24"/>
         </w:rPr>
         <w:t xml:space="preserve">Copies of all education certificates and all year mark sheets. Photocopies should include both front and back sides of the certificate.</w:t>
       </w:r>
@@ -1335,8 +1367,8 @@
           <w:b/>
           <w:bCs/>
           <w:color w:val="000000"/>
-          <w:sz w:val="22"/>
-          <w:szCs w:val="22"/>
+          <w:sz w:val="24"/>
+          <w:szCs w:val="24"/>
         </w:rPr>
         <w:t xml:space="preserve">4.  </w:t>
       </w:r>
@@ -1344,8 +1376,8 @@
         <w:rPr>
           <w:rFonts w:ascii="Verdana" w:cs="Verdana" w:eastAsia="Verdana" w:hAnsi="Verdana"/>
           <w:color w:val="000000"/>
-          <w:sz w:val="22"/>
-          <w:szCs w:val="22"/>
+          <w:sz w:val="24"/>
+          <w:szCs w:val="24"/>
         </w:rPr>
         <w:t xml:space="preserve">Relieving letter or Service Certificate from your all past employers. Include your employee number with such previous employer(s).</w:t>
       </w:r>
@@ -1362,8 +1394,8 @@
           <w:b/>
           <w:bCs/>
           <w:color w:val="000000"/>
-          <w:sz w:val="22"/>
-          <w:szCs w:val="22"/>
+          <w:sz w:val="24"/>
+          <w:szCs w:val="24"/>
         </w:rPr>
         <w:t xml:space="preserve">5.  </w:t>
       </w:r>
@@ -1371,8 +1403,8 @@
         <w:rPr>
           <w:rFonts w:ascii="Verdana" w:cs="Verdana" w:eastAsia="Verdana" w:hAnsi="Verdana"/>
           <w:color w:val="000000"/>
-          <w:sz w:val="22"/>
-          <w:szCs w:val="22"/>
+          <w:sz w:val="24"/>
+          <w:szCs w:val="24"/>
         </w:rPr>
         <w:t xml:space="preserve">Copies of Aadhar card, Passport</w:t>
       </w:r>
@@ -1389,8 +1421,8 @@
           <w:b/>
           <w:bCs/>
           <w:color w:val="000000"/>
-          <w:sz w:val="22"/>
-          <w:szCs w:val="22"/>
+          <w:sz w:val="24"/>
+          <w:szCs w:val="24"/>
         </w:rPr>
         <w:t xml:space="preserve">6.  </w:t>
       </w:r>
@@ -1398,8 +1430,8 @@
         <w:rPr>
           <w:rFonts w:ascii="Verdana" w:cs="Verdana" w:eastAsia="Verdana" w:hAnsi="Verdana"/>
           <w:color w:val="000000"/>
-          <w:sz w:val="22"/>
-          <w:szCs w:val="22"/>
+          <w:sz w:val="24"/>
+          <w:szCs w:val="24"/>
         </w:rPr>
         <w:t xml:space="preserve">Copy of PAN Card or acknowledgement slip of Form 49, if applied for PAN No.</w:t>
       </w:r>
@@ -1416,8 +1448,8 @@
           <w:b/>
           <w:bCs/>
           <w:color w:val="000000"/>
-          <w:sz w:val="22"/>
-          <w:szCs w:val="22"/>
+          <w:sz w:val="24"/>
+          <w:szCs w:val="24"/>
         </w:rPr>
         <w:t xml:space="preserve">7.  </w:t>
       </w:r>
@@ -1425,8 +1457,8 @@
         <w:rPr>
           <w:rFonts w:ascii="Verdana" w:cs="Verdana" w:eastAsia="Verdana" w:hAnsi="Verdana"/>
           <w:color w:val="000000"/>
-          <w:sz w:val="22"/>
-          <w:szCs w:val="22"/>
+          <w:sz w:val="24"/>
+          <w:szCs w:val="24"/>
         </w:rPr>
         <w:t xml:space="preserve">Bank Account Number (if available)</w:t>
       </w:r>
@@ -1443,8 +1475,8 @@
           <w:b/>
           <w:bCs/>
           <w:color w:val="000000"/>
-          <w:sz w:val="22"/>
-          <w:szCs w:val="22"/>
+          <w:sz w:val="24"/>
+          <w:szCs w:val="24"/>
         </w:rPr>
         <w:t xml:space="preserve">8.  </w:t>
       </w:r>
@@ -1452,8 +1484,8 @@
         <w:rPr>
           <w:rFonts w:ascii="Verdana" w:cs="Verdana" w:eastAsia="Verdana" w:hAnsi="Verdana"/>
           <w:color w:val="000000"/>
-          <w:sz w:val="22"/>
-          <w:szCs w:val="22"/>
+          <w:sz w:val="24"/>
+          <w:szCs w:val="24"/>
         </w:rPr>
         <w:t xml:space="preserve">Joinees family (Parents, Spouse, Children) details including their DOB</w:t>
       </w:r>
@@ -1470,8 +1502,8 @@
           <w:b/>
           <w:bCs/>
           <w:color w:val="000000"/>
-          <w:sz w:val="22"/>
-          <w:szCs w:val="22"/>
+          <w:sz w:val="24"/>
+          <w:szCs w:val="24"/>
         </w:rPr>
         <w:t xml:space="preserve">9.  </w:t>
       </w:r>
@@ -1479,8 +1511,8 @@
         <w:rPr>
           <w:rFonts w:ascii="Verdana" w:cs="Verdana" w:eastAsia="Verdana" w:hAnsi="Verdana"/>
           <w:color w:val="000000"/>
-          <w:sz w:val="22"/>
-          <w:szCs w:val="22"/>
+          <w:sz w:val="24"/>
+          <w:szCs w:val="24"/>
         </w:rPr>
         <w:t xml:space="preserve">Blood Group of Self</w:t>
       </w:r>
@@ -1497,8 +1529,8 @@
           <w:b/>
           <w:bCs/>
           <w:color w:val="000000"/>
-          <w:sz w:val="22"/>
-          <w:szCs w:val="22"/>
+          <w:sz w:val="24"/>
+          <w:szCs w:val="24"/>
         </w:rPr>
         <w:t xml:space="preserve">10.  </w:t>
       </w:r>
@@ -1506,8 +1538,8 @@
         <w:rPr>
           <w:rFonts w:ascii="Verdana" w:cs="Verdana" w:eastAsia="Verdana" w:hAnsi="Verdana"/>
           <w:color w:val="000000"/>
-          <w:sz w:val="22"/>
-          <w:szCs w:val="22"/>
+          <w:sz w:val="24"/>
+          <w:szCs w:val="24"/>
         </w:rPr>
         <w:t xml:space="preserve">If you have stated in your application that you are differently abled, please bring the disability certificate as per the prescribed format, duly filed &amp; signed.</w:t>
       </w:r>
@@ -1515,6 +1547,7 @@
     <w:p>
       <w:pPr>
         <w:spacing w:after="80" w:before="0" w:line="276" w:lineRule="auto"/>
+        <w:jc w:val="both"/>
       </w:pPr>
     </w:p>
     <w:p>
@@ -1528,8 +1561,8 @@
           <w:b/>
           <w:bCs/>
           <w:color w:val="FF0000"/>
-          <w:sz w:val="22"/>
-          <w:szCs w:val="22"/>
+          <w:sz w:val="24"/>
+          <w:szCs w:val="24"/>
         </w:rPr>
         <w:t xml:space="preserve">* Please note that all of the above documents are mandatory and you will not be allowed to join without them. Also you should bring all originals documents for verification on the Date Of Joining.</w:t>
       </w:r>
@@ -1537,13 +1570,14 @@
     <w:p>
       <w:pPr>
         <w:spacing w:after="80" w:before="0" w:line="276" w:lineRule="auto"/>
-      </w:pPr>
-      <w:r>
-        <w:rPr>
-          <w:rFonts w:ascii="Verdana" w:cs="Verdana" w:eastAsia="Verdana" w:hAnsi="Verdana"/>
-          <w:color w:val="000000"/>
-          <w:sz w:val="22"/>
-          <w:szCs w:val="22"/>
+        <w:jc w:val="both"/>
+      </w:pPr>
+      <w:r>
+        <w:rPr>
+          <w:rFonts w:ascii="Verdana" w:cs="Verdana" w:eastAsia="Verdana" w:hAnsi="Verdana"/>
+          <w:color w:val="000000"/>
+          <w:sz w:val="24"/>
+          <w:szCs w:val="24"/>
         </w:rPr>
         <w:t xml:space="preserve">Please contact us via </w:t>
       </w:r>
@@ -1551,8 +1585,8 @@
         <w:rPr>
           <w:rFonts w:ascii="Verdana" w:cs="Verdana" w:eastAsia="Verdana" w:hAnsi="Verdana"/>
           <w:color w:val="0563C1"/>
-          <w:sz w:val="22"/>
-          <w:szCs w:val="22"/>
+          <w:sz w:val="24"/>
+          <w:szCs w:val="24"/>
         </w:rPr>
         <w:t xml:space="preserve">{{CompanyEmail}}</w:t>
       </w:r>
@@ -1560,8 +1594,8 @@
         <w:rPr>
           <w:rFonts w:ascii="Verdana" w:cs="Verdana" w:eastAsia="Verdana" w:hAnsi="Verdana"/>
           <w:color w:val="000000"/>
-          <w:sz w:val="22"/>
-          <w:szCs w:val="22"/>
+          <w:sz w:val="24"/>
+          <w:szCs w:val="24"/>
         </w:rPr>
         <w:t xml:space="preserve"> for any queries regarding your employment offer.</w:t>
       </w:r>
@@ -1576,11 +1610,13 @@
           <w:pgNumType/>
           <w:docGrid w:linePitch="360"/>
         </w:sectPr>
+        <w:jc w:val="both"/>
       </w:pPr>
     </w:p>
     <w:p>
       <w:pPr>
         <w:spacing w:after="160" w:before="0" w:line="276" w:lineRule="auto"/>
+        <w:jc w:val="both"/>
       </w:pPr>
       <w:r>
         <w:rPr>
@@ -1597,11 +1633,13 @@
     <w:p>
       <w:pPr>
         <w:spacing w:after="60" w:before="0" w:line="276" w:lineRule="auto"/>
-      </w:pPr>
-    </w:p>
-    <w:p>
-      <w:pPr>
-        <w:spacing w:after="80" w:before="0" w:line="276" w:lineRule="auto"/>
+        <w:jc w:val="both"/>
+      </w:pPr>
+    </w:p>
+    <w:p>
+      <w:pPr>
+        <w:spacing w:after="80" w:before="0" w:line="276" w:lineRule="auto"/>
+        <w:jc w:val="both"/>
       </w:pPr>
       <w:r>
         <w:rPr>
@@ -1609,8 +1647,8 @@
           <w:b/>
           <w:bCs/>
           <w:color w:val="000000"/>
-          <w:sz w:val="22"/>
-          <w:szCs w:val="22"/>
+          <w:sz w:val="24"/>
+          <w:szCs w:val="24"/>
         </w:rPr>
         <w:t xml:space="preserve">COMPENSATION</w:t>
       </w:r>
@@ -1624,8 +1662,8 @@
         <w:rPr>
           <w:rFonts w:ascii="Verdana" w:cs="Verdana" w:eastAsia="Verdana" w:hAnsi="Verdana"/>
           <w:color w:val="000000"/>
-          <w:sz w:val="22"/>
-          <w:szCs w:val="22"/>
+          <w:sz w:val="24"/>
+          <w:szCs w:val="24"/>
         </w:rPr>
         <w:t xml:space="preserve">Your annual compensation (Cost To Company) will be {{CTC_Amount}} ({{CTC_Words}}). Employees are prohibited from discussing their salary with other employees. Any employee violating this policy will be considered to have committed a breach of confidentiality and will be subject to disciplinary action, up to and possibly including termination of employment.</w:t>
       </w:r>
@@ -1633,11 +1671,13 @@
     <w:p>
       <w:pPr>
         <w:spacing w:after="120" w:before="0" w:line="276" w:lineRule="auto"/>
-      </w:pPr>
-    </w:p>
-    <w:p>
-      <w:pPr>
-        <w:spacing w:after="80" w:before="0" w:line="276" w:lineRule="auto"/>
+        <w:jc w:val="both"/>
+      </w:pPr>
+    </w:p>
+    <w:p>
+      <w:pPr>
+        <w:spacing w:after="80" w:before="0" w:line="276" w:lineRule="auto"/>
+        <w:jc w:val="both"/>
       </w:pPr>
       <w:r>
         <w:rPr>
@@ -1645,8 +1685,8 @@
           <w:b/>
           <w:bCs/>
           <w:color w:val="000000"/>
-          <w:sz w:val="22"/>
-          <w:szCs w:val="22"/>
+          <w:sz w:val="24"/>
+          <w:szCs w:val="24"/>
         </w:rPr>
         <w:t xml:space="preserve">CTC STRUCTURE</w:t>
       </w:r>
@@ -1654,6 +1694,7 @@
     <w:p>
       <w:pPr>
         <w:spacing w:after="40" w:before="0" w:line="276" w:lineRule="auto"/>
+        <w:jc w:val="both"/>
       </w:pPr>
     </w:p>
     <w:tbl>
@@ -1669,9 +1710,9 @@
         </w:tblBorders>
       </w:tblPr>
       <w:tblGrid>
-        <w:gridCol w:w="4900"/>
-        <w:gridCol w:w="2153"/>
-        <w:gridCol w:w="2153"/>
+        <w:gridCol w:w="4500"/>
+        <w:gridCol w:w="2353"/>
+        <w:gridCol w:w="2353"/>
       </w:tblGrid>
       <w:tr>
         <w:tc>
@@ -1714,7 +1755,7 @@
       <w:tr>
         <w:tc>
           <w:tcPr>
-            <w:tcW w:type="dxa" w:w="4900"/>
+            <w:tcW w:type="dxa" w:w="4500"/>
             <w:tcBorders>
               <w:top w:val="single" w:color="C8D4E8" w:sz="4" w:space="0"/>
               <w:left w:val="single" w:color="C8D4E8" w:sz="4" w:space="0"/>
@@ -1741,8 +1782,8 @@
                 <w:b/>
                 <w:bCs/>
                 <w:color w:val="FFFFFF"/>
-                <w:sz w:val="22"/>
-                <w:szCs w:val="22"/>
+                <w:sz w:val="24"/>
+                <w:szCs w:val="24"/>
               </w:rPr>
               <w:t xml:space="preserve">COMPONENTS</w:t>
             </w:r>
@@ -1750,7 +1791,7 @@
         </w:tc>
         <w:tc>
           <w:tcPr>
-            <w:tcW w:type="dxa" w:w="2153"/>
+            <w:tcW w:type="dxa" w:w="2353"/>
             <w:tcBorders>
               <w:top w:val="single" w:color="C8D4E8" w:sz="4" w:space="0"/>
               <w:left w:val="single" w:color="C8D4E8" w:sz="4" w:space="0"/>
@@ -1777,8 +1818,8 @@
                 <w:b/>
                 <w:bCs/>
                 <w:color w:val="FFFFFF"/>
-                <w:sz w:val="22"/>
-                <w:szCs w:val="22"/>
+                <w:sz w:val="24"/>
+                <w:szCs w:val="24"/>
               </w:rPr>
               <w:t xml:space="preserve">MONTHLY</w:t>
             </w:r>
@@ -1786,7 +1827,7 @@
         </w:tc>
         <w:tc>
           <w:tcPr>
-            <w:tcW w:type="dxa" w:w="2153"/>
+            <w:tcW w:type="dxa" w:w="2353"/>
             <w:tcBorders>
               <w:top w:val="single" w:color="C8D4E8" w:sz="4" w:space="0"/>
               <w:left w:val="single" w:color="C8D4E8" w:sz="4" w:space="0"/>
@@ -1813,8 +1854,8 @@
                 <w:b/>
                 <w:bCs/>
                 <w:color w:val="FFFFFF"/>
-                <w:sz w:val="22"/>
-                <w:szCs w:val="22"/>
+                <w:sz w:val="24"/>
+                <w:szCs w:val="24"/>
               </w:rPr>
               <w:t xml:space="preserve">YEARLY</w:t>
             </w:r>
@@ -1824,7 +1865,7 @@
       <w:tr>
         <w:tc>
           <w:tcPr>
-            <w:tcW w:type="dxa" w:w="4900"/>
+            <w:tcW w:type="dxa" w:w="4500"/>
             <w:tcBorders>
               <w:top w:val="single" w:color="C8D4E8" w:sz="4" w:space="0"/>
               <w:left w:val="single" w:color="C8D4E8" w:sz="4" w:space="0"/>
@@ -1851,8 +1892,8 @@
                 <w:b w:val="false"/>
                 <w:bCs w:val="false"/>
                 <w:color w:val="000000"/>
-                <w:sz w:val="22"/>
-                <w:szCs w:val="22"/>
+                <w:sz w:val="24"/>
+                <w:szCs w:val="24"/>
               </w:rPr>
               <w:t xml:space="preserve">Basic</w:t>
             </w:r>
@@ -1860,7 +1901,7 @@
         </w:tc>
         <w:tc>
           <w:tcPr>
-            <w:tcW w:type="dxa" w:w="2153"/>
+            <w:tcW w:type="dxa" w:w="2353"/>
             <w:tcBorders>
               <w:top w:val="single" w:color="C8D4E8" w:sz="4" w:space="0"/>
               <w:left w:val="single" w:color="C8D4E8" w:sz="4" w:space="0"/>
@@ -1887,8 +1928,8 @@
                 <w:b w:val="false"/>
                 <w:bCs w:val="false"/>
                 <w:color w:val="000000"/>
-                <w:sz w:val="22"/>
-                <w:szCs w:val="22"/>
+                <w:sz w:val="24"/>
+                <w:szCs w:val="24"/>
               </w:rPr>
               <w:t xml:space="preserve">{{Basic_M}}</w:t>
             </w:r>
@@ -1896,7 +1937,7 @@
         </w:tc>
         <w:tc>
           <w:tcPr>
-            <w:tcW w:type="dxa" w:w="2153"/>
+            <w:tcW w:type="dxa" w:w="2353"/>
             <w:tcBorders>
               <w:top w:val="single" w:color="C8D4E8" w:sz="4" w:space="0"/>
               <w:left w:val="single" w:color="C8D4E8" w:sz="4" w:space="0"/>
@@ -1923,8 +1964,8 @@
                 <w:b w:val="false"/>
                 <w:bCs w:val="false"/>
                 <w:color w:val="000000"/>
-                <w:sz w:val="22"/>
-                <w:szCs w:val="22"/>
+                <w:sz w:val="24"/>
+                <w:szCs w:val="24"/>
               </w:rPr>
               <w:t xml:space="preserve">{{Basic_A}}</w:t>
             </w:r>
@@ -1934,7 +1975,7 @@
       <w:tr>
         <w:tc>
           <w:tcPr>
-            <w:tcW w:type="dxa" w:w="4900"/>
+            <w:tcW w:type="dxa" w:w="4500"/>
             <w:tcBorders>
               <w:top w:val="single" w:color="C8D4E8" w:sz="4" w:space="0"/>
               <w:left w:val="single" w:color="C8D4E8" w:sz="4" w:space="0"/>
@@ -1961,8 +2002,8 @@
                 <w:b w:val="false"/>
                 <w:bCs w:val="false"/>
                 <w:color w:val="000000"/>
-                <w:sz w:val="22"/>
-                <w:szCs w:val="22"/>
+                <w:sz w:val="24"/>
+                <w:szCs w:val="24"/>
               </w:rPr>
               <w:t xml:space="preserve">HRA</w:t>
             </w:r>
@@ -1970,7 +2011,7 @@
         </w:tc>
         <w:tc>
           <w:tcPr>
-            <w:tcW w:type="dxa" w:w="2153"/>
+            <w:tcW w:type="dxa" w:w="2353"/>
             <w:tcBorders>
               <w:top w:val="single" w:color="C8D4E8" w:sz="4" w:space="0"/>
               <w:left w:val="single" w:color="C8D4E8" w:sz="4" w:space="0"/>
@@ -1997,8 +2038,8 @@
                 <w:b w:val="false"/>
                 <w:bCs w:val="false"/>
                 <w:color w:val="000000"/>
-                <w:sz w:val="22"/>
-                <w:szCs w:val="22"/>
+                <w:sz w:val="24"/>
+                <w:szCs w:val="24"/>
               </w:rPr>
               <w:t xml:space="preserve">{{HRA_M}}</w:t>
             </w:r>
@@ -2006,7 +2047,7 @@
         </w:tc>
         <w:tc>
           <w:tcPr>
-            <w:tcW w:type="dxa" w:w="2153"/>
+            <w:tcW w:type="dxa" w:w="2353"/>
             <w:tcBorders>
               <w:top w:val="single" w:color="C8D4E8" w:sz="4" w:space="0"/>
               <w:left w:val="single" w:color="C8D4E8" w:sz="4" w:space="0"/>
@@ -2033,8 +2074,8 @@
                 <w:b w:val="false"/>
                 <w:bCs w:val="false"/>
                 <w:color w:val="000000"/>
-                <w:sz w:val="22"/>
-                <w:szCs w:val="22"/>
+                <w:sz w:val="24"/>
+                <w:szCs w:val="24"/>
               </w:rPr>
               <w:t xml:space="preserve">{{HRA_A}}</w:t>
             </w:r>
@@ -2044,7 +2085,7 @@
       <w:tr>
         <w:tc>
           <w:tcPr>
-            <w:tcW w:type="dxa" w:w="4900"/>
+            <w:tcW w:type="dxa" w:w="4500"/>
             <w:tcBorders>
               <w:top w:val="single" w:color="C8D4E8" w:sz="4" w:space="0"/>
               <w:left w:val="single" w:color="C8D4E8" w:sz="4" w:space="0"/>
@@ -2071,8 +2112,8 @@
                 <w:b w:val="false"/>
                 <w:bCs w:val="false"/>
                 <w:color w:val="000000"/>
-                <w:sz w:val="22"/>
-                <w:szCs w:val="22"/>
+                <w:sz w:val="24"/>
+                <w:szCs w:val="24"/>
               </w:rPr>
               <w:t xml:space="preserve">Telephone/Internet Expenses</w:t>
             </w:r>
@@ -2080,7 +2121,7 @@
         </w:tc>
         <w:tc>
           <w:tcPr>
-            <w:tcW w:type="dxa" w:w="2153"/>
+            <w:tcW w:type="dxa" w:w="2353"/>
             <w:tcBorders>
               <w:top w:val="single" w:color="C8D4E8" w:sz="4" w:space="0"/>
               <w:left w:val="single" w:color="C8D4E8" w:sz="4" w:space="0"/>
@@ -2107,8 +2148,8 @@
                 <w:b w:val="false"/>
                 <w:bCs w:val="false"/>
                 <w:color w:val="000000"/>
-                <w:sz w:val="22"/>
-                <w:szCs w:val="22"/>
+                <w:sz w:val="24"/>
+                <w:szCs w:val="24"/>
               </w:rPr>
               <w:t xml:space="preserve">{{Tel_M}}</w:t>
             </w:r>
@@ -2116,7 +2157,7 @@
         </w:tc>
         <w:tc>
           <w:tcPr>
-            <w:tcW w:type="dxa" w:w="2153"/>
+            <w:tcW w:type="dxa" w:w="2353"/>
             <w:tcBorders>
               <w:top w:val="single" w:color="C8D4E8" w:sz="4" w:space="0"/>
               <w:left w:val="single" w:color="C8D4E8" w:sz="4" w:space="0"/>
@@ -2143,8 +2184,8 @@
                 <w:b w:val="false"/>
                 <w:bCs w:val="false"/>
                 <w:color w:val="000000"/>
-                <w:sz w:val="22"/>
-                <w:szCs w:val="22"/>
+                <w:sz w:val="24"/>
+                <w:szCs w:val="24"/>
               </w:rPr>
               <w:t xml:space="preserve">{{Tel_A}}</w:t>
             </w:r>
@@ -2154,7 +2195,7 @@
       <w:tr>
         <w:tc>
           <w:tcPr>
-            <w:tcW w:type="dxa" w:w="4900"/>
+            <w:tcW w:type="dxa" w:w="4500"/>
             <w:tcBorders>
               <w:top w:val="single" w:color="C8D4E8" w:sz="4" w:space="0"/>
               <w:left w:val="single" w:color="C8D4E8" w:sz="4" w:space="0"/>
@@ -2181,8 +2222,8 @@
                 <w:b w:val="false"/>
                 <w:bCs w:val="false"/>
                 <w:color w:val="000000"/>
-                <w:sz w:val="22"/>
-                <w:szCs w:val="22"/>
+                <w:sz w:val="24"/>
+                <w:szCs w:val="24"/>
               </w:rPr>
               <w:t xml:space="preserve">Leave Travel Allowance</w:t>
             </w:r>
@@ -2190,7 +2231,7 @@
         </w:tc>
         <w:tc>
           <w:tcPr>
-            <w:tcW w:type="dxa" w:w="2153"/>
+            <w:tcW w:type="dxa" w:w="2353"/>
             <w:tcBorders>
               <w:top w:val="single" w:color="C8D4E8" w:sz="4" w:space="0"/>
               <w:left w:val="single" w:color="C8D4E8" w:sz="4" w:space="0"/>
@@ -2217,8 +2258,8 @@
                 <w:b w:val="false"/>
                 <w:bCs w:val="false"/>
                 <w:color w:val="000000"/>
-                <w:sz w:val="22"/>
-                <w:szCs w:val="22"/>
+                <w:sz w:val="24"/>
+                <w:szCs w:val="24"/>
               </w:rPr>
               <w:t xml:space="preserve">{{LTA_M}}</w:t>
             </w:r>
@@ -2226,7 +2267,7 @@
         </w:tc>
         <w:tc>
           <w:tcPr>
-            <w:tcW w:type="dxa" w:w="2153"/>
+            <w:tcW w:type="dxa" w:w="2353"/>
             <w:tcBorders>
               <w:top w:val="single" w:color="C8D4E8" w:sz="4" w:space="0"/>
               <w:left w:val="single" w:color="C8D4E8" w:sz="4" w:space="0"/>
@@ -2253,8 +2294,8 @@
                 <w:b w:val="false"/>
                 <w:bCs w:val="false"/>
                 <w:color w:val="000000"/>
-                <w:sz w:val="22"/>
-                <w:szCs w:val="22"/>
+                <w:sz w:val="24"/>
+                <w:szCs w:val="24"/>
               </w:rPr>
               <w:t xml:space="preserve">{{LTA_A}}</w:t>
             </w:r>
@@ -2264,7 +2305,7 @@
       <w:tr>
         <w:tc>
           <w:tcPr>
-            <w:tcW w:type="dxa" w:w="4900"/>
+            <w:tcW w:type="dxa" w:w="4500"/>
             <w:tcBorders>
               <w:top w:val="single" w:color="C8D4E8" w:sz="4" w:space="0"/>
               <w:left w:val="single" w:color="C8D4E8" w:sz="4" w:space="0"/>
@@ -2291,8 +2332,8 @@
                 <w:b w:val="false"/>
                 <w:bCs w:val="false"/>
                 <w:color w:val="000000"/>
-                <w:sz w:val="22"/>
-                <w:szCs w:val="22"/>
+                <w:sz w:val="24"/>
+                <w:szCs w:val="24"/>
               </w:rPr>
               <w:t xml:space="preserve">Spl. Allowance</w:t>
             </w:r>
@@ -2300,7 +2341,7 @@
         </w:tc>
         <w:tc>
           <w:tcPr>
-            <w:tcW w:type="dxa" w:w="2153"/>
+            <w:tcW w:type="dxa" w:w="2353"/>
             <w:tcBorders>
               <w:top w:val="single" w:color="C8D4E8" w:sz="4" w:space="0"/>
               <w:left w:val="single" w:color="C8D4E8" w:sz="4" w:space="0"/>
@@ -2327,8 +2368,8 @@
                 <w:b w:val="false"/>
                 <w:bCs w:val="false"/>
                 <w:color w:val="000000"/>
-                <w:sz w:val="22"/>
-                <w:szCs w:val="22"/>
+                <w:sz w:val="24"/>
+                <w:szCs w:val="24"/>
               </w:rPr>
               <w:t xml:space="preserve">{{Spl_M}}</w:t>
             </w:r>
@@ -2336,7 +2377,7 @@
         </w:tc>
         <w:tc>
           <w:tcPr>
-            <w:tcW w:type="dxa" w:w="2153"/>
+            <w:tcW w:type="dxa" w:w="2353"/>
             <w:tcBorders>
               <w:top w:val="single" w:color="C8D4E8" w:sz="4" w:space="0"/>
               <w:left w:val="single" w:color="C8D4E8" w:sz="4" w:space="0"/>
@@ -2363,8 +2404,8 @@
                 <w:b w:val="false"/>
                 <w:bCs w:val="false"/>
                 <w:color w:val="000000"/>
-                <w:sz w:val="22"/>
-                <w:szCs w:val="22"/>
+                <w:sz w:val="24"/>
+                <w:szCs w:val="24"/>
               </w:rPr>
               <w:t xml:space="preserve">{{Spl_A}}</w:t>
             </w:r>
@@ -2374,7 +2415,7 @@
       <w:tr>
         <w:tc>
           <w:tcPr>
-            <w:tcW w:type="dxa" w:w="4900"/>
+            <w:tcW w:type="dxa" w:w="4500"/>
             <w:tcBorders>
               <w:top w:val="single" w:color="C8D4E8" w:sz="4" w:space="0"/>
               <w:left w:val="single" w:color="C8D4E8" w:sz="4" w:space="0"/>
@@ -2401,8 +2442,8 @@
                 <w:b/>
                 <w:bCs/>
                 <w:color w:val="1a3c6e"/>
-                <w:sz w:val="22"/>
-                <w:szCs w:val="22"/>
+                <w:sz w:val="24"/>
+                <w:szCs w:val="24"/>
               </w:rPr>
               <w:t xml:space="preserve">Gross Salary</w:t>
             </w:r>
@@ -2410,7 +2451,7 @@
         </w:tc>
         <w:tc>
           <w:tcPr>
-            <w:tcW w:type="dxa" w:w="2153"/>
+            <w:tcW w:type="dxa" w:w="2353"/>
             <w:tcBorders>
               <w:top w:val="single" w:color="C8D4E8" w:sz="4" w:space="0"/>
               <w:left w:val="single" w:color="C8D4E8" w:sz="4" w:space="0"/>
@@ -2437,8 +2478,8 @@
                 <w:b/>
                 <w:bCs/>
                 <w:color w:val="1a3c6e"/>
-                <w:sz w:val="22"/>
-                <w:szCs w:val="22"/>
+                <w:sz w:val="24"/>
+                <w:szCs w:val="24"/>
               </w:rPr>
               <w:t xml:space="preserve">{{Gross_M}}</w:t>
             </w:r>
@@ -2446,7 +2487,7 @@
         </w:tc>
         <w:tc>
           <w:tcPr>
-            <w:tcW w:type="dxa" w:w="2153"/>
+            <w:tcW w:type="dxa" w:w="2353"/>
             <w:tcBorders>
               <w:top w:val="single" w:color="C8D4E8" w:sz="4" w:space="0"/>
               <w:left w:val="single" w:color="C8D4E8" w:sz="4" w:space="0"/>
@@ -2473,8 +2514,8 @@
                 <w:b/>
                 <w:bCs/>
                 <w:color w:val="1a3c6e"/>
-                <w:sz w:val="22"/>
-                <w:szCs w:val="22"/>
+                <w:sz w:val="24"/>
+                <w:szCs w:val="24"/>
               </w:rPr>
               <w:t xml:space="preserve">{{Gross_A}}</w:t>
             </w:r>
@@ -2484,7 +2525,7 @@
       <w:tr>
         <w:tc>
           <w:tcPr>
-            <w:tcW w:type="dxa" w:w="4900"/>
+            <w:tcW w:type="dxa" w:w="4500"/>
             <w:tcBorders>
               <w:top w:val="single" w:color="C8D4E8" w:sz="4" w:space="0"/>
               <w:left w:val="single" w:color="C8D4E8" w:sz="4" w:space="0"/>
@@ -2511,8 +2552,8 @@
                 <w:b w:val="false"/>
                 <w:bCs w:val="false"/>
                 <w:color w:val="000000"/>
-                <w:sz w:val="22"/>
-                <w:szCs w:val="22"/>
+                <w:sz w:val="24"/>
+                <w:szCs w:val="24"/>
               </w:rPr>
               <w:t xml:space="preserve">Company's PF Contribution</w:t>
             </w:r>
@@ -2520,7 +2561,7 @@
         </w:tc>
         <w:tc>
           <w:tcPr>
-            <w:tcW w:type="dxa" w:w="2153"/>
+            <w:tcW w:type="dxa" w:w="2353"/>
             <w:tcBorders>
               <w:top w:val="single" w:color="C8D4E8" w:sz="4" w:space="0"/>
               <w:left w:val="single" w:color="C8D4E8" w:sz="4" w:space="0"/>
@@ -2547,8 +2588,8 @@
                 <w:b w:val="false"/>
                 <w:bCs w:val="false"/>
                 <w:color w:val="000000"/>
-                <w:sz w:val="22"/>
-                <w:szCs w:val="22"/>
+                <w:sz w:val="24"/>
+                <w:szCs w:val="24"/>
               </w:rPr>
               <w:t xml:space="preserve">{{PF_M}}</w:t>
             </w:r>
@@ -2556,7 +2597,7 @@
         </w:tc>
         <w:tc>
           <w:tcPr>
-            <w:tcW w:type="dxa" w:w="2153"/>
+            <w:tcW w:type="dxa" w:w="2353"/>
             <w:tcBorders>
               <w:top w:val="single" w:color="C8D4E8" w:sz="4" w:space="0"/>
               <w:left w:val="single" w:color="C8D4E8" w:sz="4" w:space="0"/>
@@ -2583,8 +2624,8 @@
                 <w:b w:val="false"/>
                 <w:bCs w:val="false"/>
                 <w:color w:val="000000"/>
-                <w:sz w:val="22"/>
-                <w:szCs w:val="22"/>
+                <w:sz w:val="24"/>
+                <w:szCs w:val="24"/>
               </w:rPr>
               <w:t xml:space="preserve">{{PF_A}}</w:t>
             </w:r>
@@ -2594,557 +2635,7 @@
       <w:tr>
         <w:tc>
           <w:tcPr>
-            <w:tcW w:type="dxa" w:w="4900"/>
-            <w:tcBorders>
-              <w:top w:val="single" w:color="C8D4E8" w:sz="4" w:space="0"/>
-              <w:left w:val="single" w:color="C8D4E8" w:sz="4" w:space="0"/>
-              <w:bottom w:val="single" w:color="C8D4E8" w:sz="4" w:space="0"/>
-              <w:right w:val="single" w:color="C8D4E8" w:sz="4" w:space="0"/>
-            </w:tcBorders>
-            <w:shd w:fill="f0f4ff" w:color="FFFFFF" w:val="clear"/>
-            <w:tcMar>
-              <w:top w:type="dxa" w:w="60"/>
-              <w:left w:type="dxa" w:w="120"/>
-              <w:bottom w:type="dxa" w:w="60"/>
-              <w:right w:type="dxa" w:w="120"/>
-            </w:tcMar>
-            <w:vAlign w:val="center"/>
-          </w:tcPr>
-          <w:p>
-            <w:pPr>
-              <w:spacing w:after="0" w:before="0" w:line="276" w:lineRule="auto"/>
-              <w:jc w:val="left"/>
-            </w:pPr>
-            <w:r>
-              <w:rPr>
-                <w:rFonts w:ascii="Verdana" w:cs="Verdana" w:eastAsia="Verdana" w:hAnsi="Verdana"/>
-                <w:b w:val="false"/>
-                <w:bCs w:val="false"/>
-                <w:color w:val="000000"/>
-                <w:sz w:val="22"/>
-                <w:szCs w:val="22"/>
-              </w:rPr>
-              <w:t xml:space="preserve">Statutory Bonus</w:t>
-            </w:r>
-          </w:p>
-        </w:tc>
-        <w:tc>
-          <w:tcPr>
-            <w:tcW w:type="dxa" w:w="2153"/>
-            <w:tcBorders>
-              <w:top w:val="single" w:color="C8D4E8" w:sz="4" w:space="0"/>
-              <w:left w:val="single" w:color="C8D4E8" w:sz="4" w:space="0"/>
-              <w:bottom w:val="single" w:color="C8D4E8" w:sz="4" w:space="0"/>
-              <w:right w:val="single" w:color="C8D4E8" w:sz="4" w:space="0"/>
-            </w:tcBorders>
-            <w:shd w:fill="f0f4ff" w:color="FFFFFF" w:val="clear"/>
-            <w:tcMar>
-              <w:top w:type="dxa" w:w="60"/>
-              <w:left w:type="dxa" w:w="120"/>
-              <w:bottom w:type="dxa" w:w="60"/>
-              <w:right w:type="dxa" w:w="120"/>
-            </w:tcMar>
-            <w:vAlign w:val="center"/>
-          </w:tcPr>
-          <w:p>
-            <w:pPr>
-              <w:spacing w:after="0" w:before="0" w:line="276" w:lineRule="auto"/>
-              <w:jc w:val="right"/>
-            </w:pPr>
-            <w:r>
-              <w:rPr>
-                <w:rFonts w:ascii="Verdana" w:cs="Verdana" w:eastAsia="Verdana" w:hAnsi="Verdana"/>
-                <w:b w:val="false"/>
-                <w:bCs w:val="false"/>
-                <w:color w:val="000000"/>
-                <w:sz w:val="22"/>
-                <w:szCs w:val="22"/>
-              </w:rPr>
-              <w:t xml:space="preserve">{{SB_M}}</w:t>
-            </w:r>
-          </w:p>
-        </w:tc>
-        <w:tc>
-          <w:tcPr>
-            <w:tcW w:type="dxa" w:w="2153"/>
-            <w:tcBorders>
-              <w:top w:val="single" w:color="C8D4E8" w:sz="4" w:space="0"/>
-              <w:left w:val="single" w:color="C8D4E8" w:sz="4" w:space="0"/>
-              <w:bottom w:val="single" w:color="C8D4E8" w:sz="4" w:space="0"/>
-              <w:right w:val="single" w:color="C8D4E8" w:sz="4" w:space="0"/>
-            </w:tcBorders>
-            <w:shd w:fill="f0f4ff" w:color="FFFFFF" w:val="clear"/>
-            <w:tcMar>
-              <w:top w:type="dxa" w:w="60"/>
-              <w:left w:type="dxa" w:w="120"/>
-              <w:bottom w:type="dxa" w:w="60"/>
-              <w:right w:type="dxa" w:w="120"/>
-            </w:tcMar>
-            <w:vAlign w:val="center"/>
-          </w:tcPr>
-          <w:p>
-            <w:pPr>
-              <w:spacing w:after="0" w:before="0" w:line="276" w:lineRule="auto"/>
-              <w:jc w:val="right"/>
-            </w:pPr>
-            <w:r>
-              <w:rPr>
-                <w:rFonts w:ascii="Verdana" w:cs="Verdana" w:eastAsia="Verdana" w:hAnsi="Verdana"/>
-                <w:b w:val="false"/>
-                <w:bCs w:val="false"/>
-                <w:color w:val="000000"/>
-                <w:sz w:val="22"/>
-                <w:szCs w:val="22"/>
-              </w:rPr>
-              <w:t xml:space="preserve">{{SB_A}}</w:t>
-            </w:r>
-          </w:p>
-        </w:tc>
-      </w:tr>
-      <w:tr>
-        <w:tc>
-          <w:tcPr>
-            <w:tcW w:type="dxa" w:w="4900"/>
-            <w:tcBorders>
-              <w:top w:val="single" w:color="C8D4E8" w:sz="4" w:space="0"/>
-              <w:left w:val="single" w:color="C8D4E8" w:sz="4" w:space="0"/>
-              <w:bottom w:val="single" w:color="C8D4E8" w:sz="4" w:space="0"/>
-              <w:right w:val="single" w:color="C8D4E8" w:sz="4" w:space="0"/>
-            </w:tcBorders>
-            <w:shd w:fill="f0f4ff" w:color="FFFFFF" w:val="clear"/>
-            <w:tcMar>
-              <w:top w:type="dxa" w:w="60"/>
-              <w:left w:type="dxa" w:w="120"/>
-              <w:bottom w:type="dxa" w:w="60"/>
-              <w:right w:type="dxa" w:w="120"/>
-            </w:tcMar>
-            <w:vAlign w:val="center"/>
-          </w:tcPr>
-          <w:p>
-            <w:pPr>
-              <w:spacing w:after="0" w:before="0" w:line="276" w:lineRule="auto"/>
-              <w:jc w:val="left"/>
-            </w:pPr>
-            <w:r>
-              <w:rPr>
-                <w:rFonts w:ascii="Verdana" w:cs="Verdana" w:eastAsia="Verdana" w:hAnsi="Verdana"/>
-                <w:b w:val="false"/>
-                <w:bCs w:val="false"/>
-                <w:color w:val="000000"/>
-                <w:sz w:val="22"/>
-                <w:szCs w:val="22"/>
-              </w:rPr>
-              <w:t xml:space="preserve">Gratuity</w:t>
-            </w:r>
-          </w:p>
-        </w:tc>
-        <w:tc>
-          <w:tcPr>
-            <w:tcW w:type="dxa" w:w="2153"/>
-            <w:tcBorders>
-              <w:top w:val="single" w:color="C8D4E8" w:sz="4" w:space="0"/>
-              <w:left w:val="single" w:color="C8D4E8" w:sz="4" w:space="0"/>
-              <w:bottom w:val="single" w:color="C8D4E8" w:sz="4" w:space="0"/>
-              <w:right w:val="single" w:color="C8D4E8" w:sz="4" w:space="0"/>
-            </w:tcBorders>
-            <w:shd w:fill="f0f4ff" w:color="FFFFFF" w:val="clear"/>
-            <w:tcMar>
-              <w:top w:type="dxa" w:w="60"/>
-              <w:left w:type="dxa" w:w="120"/>
-              <w:bottom w:type="dxa" w:w="60"/>
-              <w:right w:type="dxa" w:w="120"/>
-            </w:tcMar>
-            <w:vAlign w:val="center"/>
-          </w:tcPr>
-          <w:p>
-            <w:pPr>
-              <w:spacing w:after="0" w:before="0" w:line="276" w:lineRule="auto"/>
-              <w:jc w:val="right"/>
-            </w:pPr>
-            <w:r>
-              <w:rPr>
-                <w:rFonts w:ascii="Verdana" w:cs="Verdana" w:eastAsia="Verdana" w:hAnsi="Verdana"/>
-                <w:b w:val="false"/>
-                <w:bCs w:val="false"/>
-                <w:color w:val="000000"/>
-                <w:sz w:val="22"/>
-                <w:szCs w:val="22"/>
-              </w:rPr>
-              <w:t xml:space="preserve">{{Gratuity_M}}</w:t>
-            </w:r>
-          </w:p>
-        </w:tc>
-        <w:tc>
-          <w:tcPr>
-            <w:tcW w:type="dxa" w:w="2153"/>
-            <w:tcBorders>
-              <w:top w:val="single" w:color="C8D4E8" w:sz="4" w:space="0"/>
-              <w:left w:val="single" w:color="C8D4E8" w:sz="4" w:space="0"/>
-              <w:bottom w:val="single" w:color="C8D4E8" w:sz="4" w:space="0"/>
-              <w:right w:val="single" w:color="C8D4E8" w:sz="4" w:space="0"/>
-            </w:tcBorders>
-            <w:shd w:fill="f0f4ff" w:color="FFFFFF" w:val="clear"/>
-            <w:tcMar>
-              <w:top w:type="dxa" w:w="60"/>
-              <w:left w:type="dxa" w:w="120"/>
-              <w:bottom w:type="dxa" w:w="60"/>
-              <w:right w:type="dxa" w:w="120"/>
-            </w:tcMar>
-            <w:vAlign w:val="center"/>
-          </w:tcPr>
-          <w:p>
-            <w:pPr>
-              <w:spacing w:after="0" w:before="0" w:line="276" w:lineRule="auto"/>
-              <w:jc w:val="right"/>
-            </w:pPr>
-            <w:r>
-              <w:rPr>
-                <w:rFonts w:ascii="Verdana" w:cs="Verdana" w:eastAsia="Verdana" w:hAnsi="Verdana"/>
-                <w:b w:val="false"/>
-                <w:bCs w:val="false"/>
-                <w:color w:val="000000"/>
-                <w:sz w:val="22"/>
-                <w:szCs w:val="22"/>
-              </w:rPr>
-              <w:t xml:space="preserve">{{Gratuity_A}}</w:t>
-            </w:r>
-          </w:p>
-        </w:tc>
-      </w:tr>
-      <w:tr>
-        <w:tc>
-          <w:tcPr>
-            <w:tcW w:type="dxa" w:w="4900"/>
-            <w:tcBorders>
-              <w:top w:val="single" w:color="C8D4E8" w:sz="4" w:space="0"/>
-              <w:left w:val="single" w:color="C8D4E8" w:sz="4" w:space="0"/>
-              <w:bottom w:val="single" w:color="C8D4E8" w:sz="4" w:space="0"/>
-              <w:right w:val="single" w:color="C8D4E8" w:sz="4" w:space="0"/>
-            </w:tcBorders>
-            <w:shd w:fill="f0f4ff" w:color="FFFFFF" w:val="clear"/>
-            <w:tcMar>
-              <w:top w:type="dxa" w:w="60"/>
-              <w:left w:type="dxa" w:w="120"/>
-              <w:bottom w:type="dxa" w:w="60"/>
-              <w:right w:type="dxa" w:w="120"/>
-            </w:tcMar>
-            <w:vAlign w:val="center"/>
-          </w:tcPr>
-          <w:p>
-            <w:pPr>
-              <w:spacing w:after="0" w:before="0" w:line="276" w:lineRule="auto"/>
-              <w:jc w:val="left"/>
-            </w:pPr>
-            <w:r>
-              <w:rPr>
-                <w:rFonts w:ascii="Verdana" w:cs="Verdana" w:eastAsia="Verdana" w:hAnsi="Verdana"/>
-                <w:b w:val="false"/>
-                <w:bCs w:val="false"/>
-                <w:color w:val="000000"/>
-                <w:sz w:val="22"/>
-                <w:szCs w:val="22"/>
-              </w:rPr>
-              <w:t xml:space="preserve">ESI</w:t>
-            </w:r>
-          </w:p>
-        </w:tc>
-        <w:tc>
-          <w:tcPr>
-            <w:tcW w:type="dxa" w:w="2153"/>
-            <w:tcBorders>
-              <w:top w:val="single" w:color="C8D4E8" w:sz="4" w:space="0"/>
-              <w:left w:val="single" w:color="C8D4E8" w:sz="4" w:space="0"/>
-              <w:bottom w:val="single" w:color="C8D4E8" w:sz="4" w:space="0"/>
-              <w:right w:val="single" w:color="C8D4E8" w:sz="4" w:space="0"/>
-            </w:tcBorders>
-            <w:shd w:fill="f0f4ff" w:color="FFFFFF" w:val="clear"/>
-            <w:tcMar>
-              <w:top w:type="dxa" w:w="60"/>
-              <w:left w:type="dxa" w:w="120"/>
-              <w:bottom w:type="dxa" w:w="60"/>
-              <w:right w:type="dxa" w:w="120"/>
-            </w:tcMar>
-            <w:vAlign w:val="center"/>
-          </w:tcPr>
-          <w:p>
-            <w:pPr>
-              <w:spacing w:after="0" w:before="0" w:line="276" w:lineRule="auto"/>
-              <w:jc w:val="right"/>
-            </w:pPr>
-            <w:r>
-              <w:rPr>
-                <w:rFonts w:ascii="Verdana" w:cs="Verdana" w:eastAsia="Verdana" w:hAnsi="Verdana"/>
-                <w:b w:val="false"/>
-                <w:bCs w:val="false"/>
-                <w:color w:val="000000"/>
-                <w:sz w:val="22"/>
-                <w:szCs w:val="22"/>
-              </w:rPr>
-              <w:t xml:space="preserve">{{ESI_M}}</w:t>
-            </w:r>
-          </w:p>
-        </w:tc>
-        <w:tc>
-          <w:tcPr>
-            <w:tcW w:type="dxa" w:w="2153"/>
-            <w:tcBorders>
-              <w:top w:val="single" w:color="C8D4E8" w:sz="4" w:space="0"/>
-              <w:left w:val="single" w:color="C8D4E8" w:sz="4" w:space="0"/>
-              <w:bottom w:val="single" w:color="C8D4E8" w:sz="4" w:space="0"/>
-              <w:right w:val="single" w:color="C8D4E8" w:sz="4" w:space="0"/>
-            </w:tcBorders>
-            <w:shd w:fill="f0f4ff" w:color="FFFFFF" w:val="clear"/>
-            <w:tcMar>
-              <w:top w:type="dxa" w:w="60"/>
-              <w:left w:type="dxa" w:w="120"/>
-              <w:bottom w:type="dxa" w:w="60"/>
-              <w:right w:type="dxa" w:w="120"/>
-            </w:tcMar>
-            <w:vAlign w:val="center"/>
-          </w:tcPr>
-          <w:p>
-            <w:pPr>
-              <w:spacing w:after="0" w:before="0" w:line="276" w:lineRule="auto"/>
-              <w:jc w:val="right"/>
-            </w:pPr>
-            <w:r>
-              <w:rPr>
-                <w:rFonts w:ascii="Verdana" w:cs="Verdana" w:eastAsia="Verdana" w:hAnsi="Verdana"/>
-                <w:b w:val="false"/>
-                <w:bCs w:val="false"/>
-                <w:color w:val="000000"/>
-                <w:sz w:val="22"/>
-                <w:szCs w:val="22"/>
-              </w:rPr>
-              <w:t xml:space="preserve">{{ESI_A}}</w:t>
-            </w:r>
-          </w:p>
-        </w:tc>
-      </w:tr>
-      <w:tr>
-        <w:tc>
-          <w:tcPr>
-            <w:tcW w:type="dxa" w:w="4900"/>
-            <w:tcBorders>
-              <w:top w:val="single" w:color="C8D4E8" w:sz="4" w:space="0"/>
-              <w:left w:val="single" w:color="C8D4E8" w:sz="4" w:space="0"/>
-              <w:bottom w:val="single" w:color="C8D4E8" w:sz="4" w:space="0"/>
-              <w:right w:val="single" w:color="C8D4E8" w:sz="4" w:space="0"/>
-            </w:tcBorders>
-            <w:shd w:fill="FFFFFF" w:color="FFFFFF" w:val="clear"/>
-            <w:tcMar>
-              <w:top w:type="dxa" w:w="60"/>
-              <w:left w:type="dxa" w:w="120"/>
-              <w:bottom w:type="dxa" w:w="60"/>
-              <w:right w:type="dxa" w:w="120"/>
-            </w:tcMar>
-            <w:vAlign w:val="center"/>
-          </w:tcPr>
-          <w:p>
-            <w:pPr>
-              <w:spacing w:after="0" w:before="0" w:line="276" w:lineRule="auto"/>
-              <w:jc w:val="left"/>
-            </w:pPr>
-            <w:r>
-              <w:rPr>
-                <w:rFonts w:ascii="Verdana" w:cs="Verdana" w:eastAsia="Verdana" w:hAnsi="Verdana"/>
-                <w:b w:val="false"/>
-                <w:bCs w:val="false"/>
-                <w:color w:val="000000"/>
-                <w:sz w:val="22"/>
-                <w:szCs w:val="22"/>
-              </w:rPr>
-              <w:t xml:space="preserve">Variable Pay</w:t>
-            </w:r>
-          </w:p>
-        </w:tc>
-        <w:tc>
-          <w:tcPr>
-            <w:tcW w:type="dxa" w:w="2153"/>
-            <w:tcBorders>
-              <w:top w:val="single" w:color="C8D4E8" w:sz="4" w:space="0"/>
-              <w:left w:val="single" w:color="C8D4E8" w:sz="4" w:space="0"/>
-              <w:bottom w:val="single" w:color="C8D4E8" w:sz="4" w:space="0"/>
-              <w:right w:val="single" w:color="C8D4E8" w:sz="4" w:space="0"/>
-            </w:tcBorders>
-            <w:shd w:fill="FFFFFF" w:color="FFFFFF" w:val="clear"/>
-            <w:tcMar>
-              <w:top w:type="dxa" w:w="60"/>
-              <w:left w:type="dxa" w:w="120"/>
-              <w:bottom w:type="dxa" w:w="60"/>
-              <w:right w:type="dxa" w:w="120"/>
-            </w:tcMar>
-            <w:vAlign w:val="center"/>
-          </w:tcPr>
-          <w:p>
-            <w:pPr>
-              <w:spacing w:after="0" w:before="0" w:line="276" w:lineRule="auto"/>
-              <w:jc w:val="right"/>
-            </w:pPr>
-            <w:r>
-              <w:rPr>
-                <w:rFonts w:ascii="Verdana" w:cs="Verdana" w:eastAsia="Verdana" w:hAnsi="Verdana"/>
-                <w:b w:val="false"/>
-                <w:bCs w:val="false"/>
-                <w:color w:val="000000"/>
-                <w:sz w:val="22"/>
-                <w:szCs w:val="22"/>
-              </w:rPr>
-              <w:t xml:space="preserve"/>
-            </w:r>
-          </w:p>
-        </w:tc>
-        <w:tc>
-          <w:tcPr>
-            <w:tcW w:type="dxa" w:w="2153"/>
-            <w:tcBorders>
-              <w:top w:val="single" w:color="C8D4E8" w:sz="4" w:space="0"/>
-              <w:left w:val="single" w:color="C8D4E8" w:sz="4" w:space="0"/>
-              <w:bottom w:val="single" w:color="C8D4E8" w:sz="4" w:space="0"/>
-              <w:right w:val="single" w:color="C8D4E8" w:sz="4" w:space="0"/>
-            </w:tcBorders>
-            <w:shd w:fill="FFFFFF" w:color="FFFFFF" w:val="clear"/>
-            <w:tcMar>
-              <w:top w:type="dxa" w:w="60"/>
-              <w:left w:type="dxa" w:w="120"/>
-              <w:bottom w:type="dxa" w:w="60"/>
-              <w:right w:type="dxa" w:w="120"/>
-            </w:tcMar>
-            <w:vAlign w:val="center"/>
-          </w:tcPr>
-          <w:p>
-            <w:pPr>
-              <w:spacing w:after="0" w:before="0" w:line="276" w:lineRule="auto"/>
-              <w:jc w:val="right"/>
-            </w:pPr>
-            <w:r>
-              <w:rPr>
-                <w:rFonts w:ascii="Verdana" w:cs="Verdana" w:eastAsia="Verdana" w:hAnsi="Verdana"/>
-                <w:b w:val="false"/>
-                <w:bCs w:val="false"/>
-                <w:color w:val="000000"/>
-                <w:sz w:val="22"/>
-                <w:szCs w:val="22"/>
-              </w:rPr>
-              <w:t xml:space="preserve"/>
-            </w:r>
-          </w:p>
-        </w:tc>
-      </w:tr>
-      <w:tr>
-        <w:tc>
-          <w:tcPr>
-            <w:tcW w:type="dxa" w:w="4900"/>
-            <w:tcBorders>
-              <w:top w:val="single" w:color="C8D4E8" w:sz="4" w:space="0"/>
-              <w:left w:val="single" w:color="C8D4E8" w:sz="4" w:space="0"/>
-              <w:bottom w:val="single" w:color="C8D4E8" w:sz="4" w:space="0"/>
-              <w:right w:val="single" w:color="C8D4E8" w:sz="4" w:space="0"/>
-            </w:tcBorders>
-            <w:shd w:fill="FFFFFF" w:color="FFFFFF" w:val="clear"/>
-            <w:tcMar>
-              <w:top w:type="dxa" w:w="60"/>
-              <w:left w:type="dxa" w:w="120"/>
-              <w:bottom w:type="dxa" w:w="60"/>
-              <w:right w:type="dxa" w:w="120"/>
-            </w:tcMar>
-            <w:vAlign w:val="center"/>
-          </w:tcPr>
-          <w:p>
-            <w:pPr>
-              <w:spacing w:after="0" w:before="0" w:line="276" w:lineRule="auto"/>
-              <w:jc w:val="left"/>
-            </w:pPr>
-            <w:r>
-              <w:rPr>
-                <w:rFonts w:ascii="Verdana" w:cs="Verdana" w:eastAsia="Verdana" w:hAnsi="Verdana"/>
-                <w:b w:val="false"/>
-                <w:bCs w:val="false"/>
-                <w:color w:val="000000"/>
-                <w:sz w:val="22"/>
-                <w:szCs w:val="22"/>
-              </w:rPr>
-              <w:t xml:space="preserve">Insurance premiums (GMC, GPA and Term life)</w:t>
-            </w:r>
-          </w:p>
-        </w:tc>
-        <w:tc>
-          <w:tcPr>
-            <w:tcW w:type="dxa" w:w="2153"/>
-            <w:tcBorders>
-              <w:top w:val="single" w:color="C8D4E8" w:sz="4" w:space="0"/>
-              <w:left w:val="single" w:color="C8D4E8" w:sz="4" w:space="0"/>
-              <w:bottom w:val="single" w:color="C8D4E8" w:sz="4" w:space="0"/>
-              <w:right w:val="single" w:color="C8D4E8" w:sz="4" w:space="0"/>
-            </w:tcBorders>
-            <w:shd w:fill="FFFFFF" w:color="FFFFFF" w:val="clear"/>
-            <w:tcMar>
-              <w:top w:type="dxa" w:w="60"/>
-              <w:left w:type="dxa" w:w="120"/>
-              <w:bottom w:type="dxa" w:w="60"/>
-              <w:right w:type="dxa" w:w="120"/>
-            </w:tcMar>
-            <w:vAlign w:val="center"/>
-          </w:tcPr>
-          <w:p>
-            <w:pPr>
-              <w:spacing w:after="0" w:before="0" w:line="276" w:lineRule="auto"/>
-              <w:jc w:val="right"/>
-            </w:pPr>
-            <w:r>
-              <w:rPr>
-                <w:rFonts w:ascii="Verdana" w:cs="Verdana" w:eastAsia="Verdana" w:hAnsi="Verdana"/>
-                <w:b w:val="false"/>
-                <w:bCs w:val="false"/>
-                <w:color w:val="000000"/>
-                <w:sz w:val="22"/>
-                <w:szCs w:val="22"/>
-              </w:rPr>
-              <w:t xml:space="preserve"/>
-            </w:r>
-          </w:p>
-        </w:tc>
-        <w:tc>
-          <w:tcPr>
-            <w:tcW w:type="dxa" w:w="2153"/>
-            <w:tcBorders>
-              <w:top w:val="single" w:color="C8D4E8" w:sz="4" w:space="0"/>
-              <w:left w:val="single" w:color="C8D4E8" w:sz="4" w:space="0"/>
-              <w:bottom w:val="single" w:color="C8D4E8" w:sz="4" w:space="0"/>
-              <w:right w:val="single" w:color="C8D4E8" w:sz="4" w:space="0"/>
-            </w:tcBorders>
-            <w:shd w:fill="FFFFFF" w:color="FFFFFF" w:val="clear"/>
-            <w:tcMar>
-              <w:top w:type="dxa" w:w="60"/>
-              <w:left w:type="dxa" w:w="120"/>
-              <w:bottom w:type="dxa" w:w="60"/>
-              <w:right w:type="dxa" w:w="120"/>
-            </w:tcMar>
-            <w:vAlign w:val="center"/>
-          </w:tcPr>
-          <w:p>
-            <w:pPr>
-              <w:spacing w:after="0" w:before="0" w:line="276" w:lineRule="auto"/>
-              <w:jc w:val="right"/>
-            </w:pPr>
-            <w:r>
-              <w:rPr>
-                <w:rFonts w:ascii="Verdana" w:cs="Verdana" w:eastAsia="Verdana" w:hAnsi="Verdana"/>
-                <w:b w:val="false"/>
-                <w:bCs w:val="false"/>
-                <w:color w:val="000000"/>
-                <w:sz w:val="22"/>
-                <w:szCs w:val="22"/>
-              </w:rPr>
-              <w:t xml:space="preserve"/>
-            </w:r>
-          </w:p>
-        </w:tc>
-      </w:tr>
-      <w:tr>
-        <w:tc>
-          <w:tcPr>
-            <w:tcW w:type="dxa" w:w="4900"/>
+            <w:tcW w:type="dxa" w:w="4500"/>
             <w:tcBorders>
               <w:top w:val="single" w:color="C8D4E8" w:sz="4" w:space="0"/>
               <w:left w:val="single" w:color="C8D4E8" w:sz="4" w:space="0"/>
@@ -3171,8 +2662,8 @@
                 <w:b/>
                 <w:bCs/>
                 <w:color w:val="1a3c6e"/>
-                <w:sz w:val="22"/>
-                <w:szCs w:val="22"/>
+                <w:sz w:val="24"/>
+                <w:szCs w:val="24"/>
               </w:rPr>
               <w:t xml:space="preserve">Cost To Company</w:t>
             </w:r>
@@ -3180,7 +2671,7 @@
         </w:tc>
         <w:tc>
           <w:tcPr>
-            <w:tcW w:type="dxa" w:w="2153"/>
+            <w:tcW w:type="dxa" w:w="2353"/>
             <w:tcBorders>
               <w:top w:val="single" w:color="C8D4E8" w:sz="4" w:space="0"/>
               <w:left w:val="single" w:color="C8D4E8" w:sz="4" w:space="0"/>
@@ -3207,8 +2698,8 @@
                 <w:b/>
                 <w:bCs/>
                 <w:color w:val="1a3c6e"/>
-                <w:sz w:val="22"/>
-                <w:szCs w:val="22"/>
+                <w:sz w:val="24"/>
+                <w:szCs w:val="24"/>
               </w:rPr>
               <w:t xml:space="preserve">{{CTC_M}}</w:t>
             </w:r>
@@ -3216,7 +2707,7 @@
         </w:tc>
         <w:tc>
           <w:tcPr>
-            <w:tcW w:type="dxa" w:w="2153"/>
+            <w:tcW w:type="dxa" w:w="2353"/>
             <w:tcBorders>
               <w:top w:val="single" w:color="C8D4E8" w:sz="4" w:space="0"/>
               <w:left w:val="single" w:color="C8D4E8" w:sz="4" w:space="0"/>
@@ -3243,8 +2734,8 @@
                 <w:b/>
                 <w:bCs/>
                 <w:color w:val="1a3c6e"/>
-                <w:sz w:val="22"/>
-                <w:szCs w:val="22"/>
+                <w:sz w:val="24"/>
+                <w:szCs w:val="24"/>
               </w:rPr>
               <w:t xml:space="preserve">{{CTC_A}}</w:t>
             </w:r>
@@ -3255,6 +2746,7 @@
     <w:p>
       <w:pPr>
         <w:spacing w:after="80" w:before="0" w:line="276" w:lineRule="auto"/>
+        <w:jc w:val="both"/>
       </w:pPr>
     </w:p>
     <w:sectPr>
@@ -3634,7 +3126,7 @@
 </file>
 
 <file path=word/styles.xml><?xml version="1.0" encoding="utf-8"?>
-<w:styles xmlns:mc="http://schemas.openxmlformats.org/markup-compatibility/2006" xmlns:r="http://schemas.openxmlformats.org/officeDocument/2006/relationships" xmlns:w="http://schemas.openxmlformats.org/wordprocessingml/2006/main" xmlns:w14="http://schemas.microsoft.com/office/word/2010/wordml" xmlns:w15="http://schemas.microsoft.com/office/word/2012/wordml" mc:Ignorable="w14 w15">
+<w:styles xmlns:mc="http://schemas.openxmlformats.org/markup-compatibility/2006" xmlns:w="http://schemas.openxmlformats.org/wordprocessingml/2006/main" mc:Ignorable="w14 w15">
   <w:docDefaults>
     <w:rPrDefault>
       <w:rPr>

</xml_diff>